<commit_message>
fix: Ansprechpartner Bianca Hochuli durch Moreno Meier ersetzen
- Word-Template aktualisiert (Moreno Meier statt Bianca Hochuli)
- ansprechpartner.json: bho -> mme (BSc FHNW in Geomatik, GSL Zürich)
- Benjamin Patt Funktion: Bereichsleitung -> Bereichsleiter
- Default-Ansprechpartner-IDs: ['bpa', 'mme']
- Admin-Ansicht AnsprechpartnerTab aktualisiert
- Unterschrift-Datei unterschrift-mme.jpg hinzugefügt

Co-Authored-By: Claude Opus 4.6 (1M context) <noreply@anthropic.com>
</commit_message>
<xml_diff>
--- a/hmq-offerten/public/Offerte_Template_V11.docx
+++ b/hmq-offerten/public/Offerte_Template_V11.docx
@@ -134,7 +134,6 @@
                   <w:listItem w:displayText="Voa la Schena 2 · 7077 Valbella" w:value="Voa la Schena 2 · 7077 Valbella"/>
                 </w:dropDownList>
               </w:sdtPr>
-              <w:sdtEndPr/>
               <w:sdtContent>
                 <w:r>
                   <w:rPr>
@@ -187,59 +186,40 @@
             </w:tcBorders>
           </w:tcPr>
           <w:p>
-            <w:pPr>
-              <w:rPr/>
-            </w:pPr>
-            <w:r>
-              <w:rPr/>
+            <w:r>
               <w:t>{{FIRMA}}</w:t>
-            </w:r>
-          </w:p>
-          <w:p w14:paraId="ABT00001">
-            <w:pPr>
-              <w:rPr/>
-            </w:pPr>
-            <w:r>
-              <w:rPr/>
-              <w:t>{{ABTEILUNG}}</w:t>
             </w:r>
           </w:p>
           <w:p>
-            <w:pPr>
-              <w:rPr/>
-            </w:pPr>
-            <w:r>
-              <w:rPr/>
-              <w:t>{{KONTAKT_ZEILE}}</w:t>
+            <w:r>
+              <w:t>{{ABTEILUNG}}</w:t>
             </w:r>
           </w:p>
           <w:p>
-            <w:pPr>
-              <w:rPr/>
-            </w:pPr>
-            <w:proofErr w:type="spellStart"/>
-            <w:r>
-              <w:rPr/>
-              <w:t>{{FUNKTION_1}}</w:t>
-            </w:r>
-            <w:proofErr w:type="spellEnd"/>
-            <w:r>
-              <w:rPr/>
-              <w:t xml:space="preserve">{{FUNKTION_2}}</w:t>
+            <w:r>
+              <w:t>{{KONTAKT_ZEILE}}</w:t>
             </w:r>
           </w:p>
           <w:p>
-            <w:pPr>
-              <w:rPr/>
-            </w:pPr>
-            <w:r>
-              <w:rPr/>
-              <w:t>{{STRASSE}}</w:t>
+            <w:r>
+              <w:t>{{FUNKTION_1</w:t>
+            </w:r>
+            <w:proofErr w:type="gramStart"/>
+            <w:r>
+              <w:t>}}{</w:t>
+            </w:r>
+            <w:proofErr w:type="gramEnd"/>
+            <w:r>
+              <w:t>{FUNKTION_2}}</w:t>
             </w:r>
           </w:p>
           <w:p>
             <w:r>
-              <w:rPr/>
+              <w:t>{{STRASSE}}</w:t>
+            </w:r>
+          </w:p>
+          <w:p>
+            <w:r>
               <w:t>{{PLZ_ORT}}</w:t>
             </w:r>
           </w:p>
@@ -276,7 +256,6 @@
           <w:p>
             <w:sdt>
               <w:sdtPr>
-                <w:rPr/>
                 <w:alias w:val="Bürostandort"/>
                 <w:tag w:val="Bürostandort"/>
                 <w:id w:val="2130127238"/>
@@ -292,24 +271,18 @@
                   <w:listItem w:displayText="Valbella" w:value="Valbella"/>
                 </w:dropDownList>
               </w:sdtPr>
-              <w:sdtEndPr/>
               <w:sdtContent>
                 <w:r>
-                  <w:rPr/>
                   <w:t>{{STANDORT}}</w:t>
                 </w:r>
               </w:sdtContent>
             </w:sdt>
             <w:r>
-              <w:rPr/>
               <w:t xml:space="preserve">, </w:t>
             </w:r>
-            <w:proofErr w:type="spellStart"/>
-            <w:r>
-              <w:rPr/>
+            <w:r>
               <w:t>{{DATUM}}</w:t>
             </w:r>
-            <w:proofErr w:type="spellEnd"/>
           </w:p>
         </w:tc>
       </w:tr>
@@ -357,28 +330,76 @@
                 <w:b/>
                 <w:sz w:val="22"/>
               </w:rPr>
-              <w:t>{{OFFNR_A}}</w:t>
-            </w:r>
+              <w:t>{{OFFNR_A</w:t>
+            </w:r>
+            <w:proofErr w:type="gramStart"/>
             <w:r>
               <w:rPr>
                 <w:b/>
                 <w:sz w:val="22"/>
               </w:rPr>
-              <w:t>{{OFFNR_B}}</w:t>
+              <w:t>}}</w:t>
             </w:r>
             <w:r>
               <w:rPr>
                 <w:b/>
                 <w:sz w:val="22"/>
               </w:rPr>
-              <w:t>{{OFFNR_C}}</w:t>
-            </w:r>
+              <w:t>{</w:t>
+            </w:r>
+            <w:proofErr w:type="gramEnd"/>
             <w:r>
               <w:rPr>
                 <w:b/>
                 <w:sz w:val="22"/>
               </w:rPr>
-              <w:t>{{OFFNR_D}}: Offerte für Beweissicherung</w:t>
+              <w:t>{OFFNR_B</w:t>
+            </w:r>
+            <w:proofErr w:type="gramStart"/>
+            <w:r>
+              <w:rPr>
+                <w:b/>
+                <w:sz w:val="22"/>
+              </w:rPr>
+              <w:t>}}</w:t>
+            </w:r>
+            <w:r>
+              <w:rPr>
+                <w:b/>
+                <w:sz w:val="22"/>
+              </w:rPr>
+              <w:t>{</w:t>
+            </w:r>
+            <w:proofErr w:type="gramEnd"/>
+            <w:r>
+              <w:rPr>
+                <w:b/>
+                <w:sz w:val="22"/>
+              </w:rPr>
+              <w:t>{OFFNR_C</w:t>
+            </w:r>
+            <w:proofErr w:type="gramStart"/>
+            <w:r>
+              <w:rPr>
+                <w:b/>
+                <w:sz w:val="22"/>
+              </w:rPr>
+              <w:t>}}</w:t>
+            </w:r>
+            <w:r>
+              <w:rPr>
+                <w:b/>
+                <w:sz w:val="22"/>
+              </w:rPr>
+              <w:t>{</w:t>
+            </w:r>
+            <w:proofErr w:type="gramEnd"/>
+            <w:r>
+              <w:rPr>
+                <w:b/>
+                <w:sz w:val="22"/>
+              </w:rPr>
+              <w:t>{OFFNR_D}}: Offerte für Beweissicherung</w:t>
             </w:r>
           </w:p>
         </w:tc>
@@ -413,23 +434,23 @@
                 <w:b/>
                 <w:sz w:val="22"/>
               </w:rPr>
-              <w:t xml:space="preserve">{{PROJEKT_ORT}}, </w:t>
-            </w:r>
-            <w:proofErr w:type="spellStart"/>
+              <w:t>{{PROJEKT_ORT}}, {{PROJEKT_BEZ1</w:t>
+            </w:r>
+            <w:proofErr w:type="gramStart"/>
             <w:r>
               <w:rPr>
                 <w:b/>
                 <w:sz w:val="22"/>
               </w:rPr>
-              <w:t>{{PROJEKT_BEZ1}}</w:t>
-            </w:r>
-            <w:proofErr w:type="spellEnd"/>
+              <w:t>}}{</w:t>
+            </w:r>
+            <w:proofErr w:type="gramEnd"/>
             <w:r>
               <w:rPr>
                 <w:b/>
                 <w:sz w:val="22"/>
               </w:rPr>
-              <w:t xml:space="preserve">{{PROJEKT_BEZ2}}</w:t>
+              <w:t>{PROJEKT_BEZ2}}</w:t>
             </w:r>
           </w:p>
         </w:tc>
@@ -468,7 +489,6 @@
           </w:tcPr>
           <w:p>
             <w:r>
-              <w:rPr/>
               <w:t>{{ANREDE}}</w:t>
             </w:r>
           </w:p>
@@ -522,23 +542,26 @@
               <w:t xml:space="preserve">Ihre Anfrage vom </w:t>
             </w:r>
             <w:r>
-              <w:rPr/>
-              <w:t xml:space="preserve">{{ANF_TAG}}</w:t>
-            </w:r>
-            <w:r>
-              <w:rPr/>
-              <w:t>{{ANF_MONAT}}</w:t>
-            </w:r>
-            <w:r>
-              <w:rPr/>
+              <w:t>{{ANF_TAG</w:t>
+            </w:r>
+            <w:proofErr w:type="gramStart"/>
+            <w:r>
+              <w:t>}}</w:t>
+            </w:r>
+            <w:r>
+              <w:t>{</w:t>
+            </w:r>
+            <w:proofErr w:type="gramEnd"/>
+            <w:r>
+              <w:t>{ANF_MONAT}}</w:t>
+            </w:r>
+            <w:r>
               <w:t xml:space="preserve"> 20</w:t>
             </w:r>
             <w:r>
-              <w:rPr/>
               <w:t>2</w:t>
             </w:r>
             <w:r>
-              <w:rPr/>
               <w:t>5</w:t>
             </w:r>
             <w:r>
@@ -678,7 +701,6 @@
                   <w14:uncheckedState w14:val="2610" w14:font="MS Gothic"/>
                 </w14:checkbox>
               </w:sdtPr>
-              <w:sdtEndPr/>
               <w:sdtContent>
                 <w:r>
                   <w:rPr>
@@ -707,7 +729,6 @@
                   <w14:uncheckedState w14:val="2610" w14:font="MS Gothic"/>
                 </w14:checkbox>
               </w:sdtPr>
-              <w:sdtEndPr/>
               <w:sdtContent>
                 <w:r>
                   <w:rPr>
@@ -732,7 +753,6 @@
                   <w14:uncheckedState w14:val="2610" w14:font="MS Gothic"/>
                 </w14:checkbox>
               </w:sdtPr>
-              <w:sdtEndPr/>
               <w:sdtContent>
                 <w:r>
                   <w:rPr>
@@ -760,7 +780,6 @@
                   <w14:uncheckedState w14:val="2610" w14:font="MS Gothic"/>
                 </w14:checkbox>
               </w:sdtPr>
-              <w:sdtEndPr/>
               <w:sdtContent>
                 <w:r>
                   <w:rPr>
@@ -804,7 +823,6 @@
                   <w14:uncheckedState w14:val="2610" w14:font="MS Gothic"/>
                 </w14:checkbox>
               </w:sdtPr>
-              <w:sdtEndPr/>
               <w:sdtContent>
                 <w:r>
                   <w:rPr>
@@ -836,7 +854,6 @@
                   <w14:uncheckedState w14:val="2610" w14:font="MS Gothic"/>
                 </w14:checkbox>
               </w:sdtPr>
-              <w:sdtEndPr/>
               <w:sdtContent>
                 <w:r>
                   <w:rPr>
@@ -877,7 +894,6 @@
                   <w14:uncheckedState w14:val="2610" w14:font="MS Gothic"/>
                 </w14:checkbox>
               </w:sdtPr>
-              <w:sdtEndPr/>
               <w:sdtContent>
                 <w:r>
                   <w:rPr>
@@ -908,7 +924,6 @@
                   <w14:uncheckedState w14:val="2610" w14:font="MS Gothic"/>
                 </w14:checkbox>
               </w:sdtPr>
-              <w:sdtEndPr/>
               <w:sdtContent>
                 <w:r>
                   <w:rPr>
@@ -952,7 +967,6 @@
                   <w14:uncheckedState w14:val="2610" w14:font="MS Gothic"/>
                 </w14:checkbox>
               </w:sdtPr>
-              <w:sdtEndPr/>
               <w:sdtContent>
                 <w:r>
                   <w:rPr>
@@ -977,7 +991,6 @@
                   <w14:uncheckedState w14:val="2610" w14:font="MS Gothic"/>
                 </w14:checkbox>
               </w:sdtPr>
-              <w:sdtEndPr/>
               <w:sdtContent>
                 <w:r>
                   <w:rPr>
@@ -1015,7 +1028,6 @@
                   <w14:uncheckedState w14:val="2610" w14:font="MS Gothic"/>
                 </w14:checkbox>
               </w:sdtPr>
-              <w:sdtEndPr/>
               <w:sdtContent>
                 <w:r>
                   <w:rPr>
@@ -1040,7 +1052,6 @@
                   <w14:uncheckedState w14:val="2610" w14:font="MS Gothic"/>
                 </w14:checkbox>
               </w:sdtPr>
-              <w:sdtEndPr/>
               <w:sdtContent>
                 <w:r>
                   <w:rPr>
@@ -1149,7 +1160,6 @@
                   <w14:uncheckedState w14:val="2610" w14:font="MS Gothic"/>
                 </w14:checkbox>
               </w:sdtPr>
-              <w:sdtEndPr/>
               <w:sdtContent>
                 <w:r>
                   <w:rPr>
@@ -1178,7 +1188,6 @@
                   <w14:uncheckedState w14:val="2610" w14:font="MS Gothic"/>
                 </w14:checkbox>
               </w:sdtPr>
-              <w:sdtEndPr/>
               <w:sdtContent>
                 <w:r>
                   <w:rPr>
@@ -1222,7 +1231,6 @@
                   <w14:uncheckedState w14:val="2610" w14:font="MS Gothic"/>
                 </w14:checkbox>
               </w:sdtPr>
-              <w:sdtEndPr/>
               <w:sdtContent>
                 <w:r>
                   <w:rPr>
@@ -1250,7 +1258,6 @@
                   <w14:uncheckedState w14:val="2610" w14:font="MS Gothic"/>
                 </w14:checkbox>
               </w:sdtPr>
-              <w:sdtEndPr/>
               <w:sdtContent>
                 <w:r>
                   <w:rPr>
@@ -1294,7 +1301,6 @@
                   <w14:uncheckedState w14:val="2610" w14:font="MS Gothic"/>
                 </w14:checkbox>
               </w:sdtPr>
-              <w:sdtEndPr/>
               <w:sdtContent>
                 <w:r>
                   <w:rPr>
@@ -1331,7 +1337,6 @@
                   <w14:uncheckedState w14:val="2610" w14:font="MS Gothic"/>
                 </w14:checkbox>
               </w:sdtPr>
-              <w:sdtEndPr/>
               <w:sdtContent>
                 <w:r>
                   <w:rPr>
@@ -1371,7 +1376,6 @@
                   <w14:uncheckedState w14:val="2610" w14:font="MS Gothic"/>
                 </w14:checkbox>
               </w:sdtPr>
-              <w:sdtEndPr/>
               <w:sdtContent>
                 <w:r>
                   <w:rPr>
@@ -1399,7 +1403,6 @@
                   <w14:uncheckedState w14:val="2610" w14:font="MS Gothic"/>
                 </w14:checkbox>
               </w:sdtPr>
-              <w:sdtEndPr/>
               <w:sdtContent>
                 <w:r>
                   <w:rPr>
@@ -1436,6 +1439,7 @@
           <w:caps/>
           <w:sz w:val="22"/>
         </w:rPr>
+        <w:lastRenderedPageBreak/>
         <w:br w:type="textWrapping" w:clear="all"/>
       </w:r>
     </w:p>
@@ -1459,7 +1463,6 @@
           <w:caps/>
           <w:sz w:val="22"/>
         </w:rPr>
-        <w:lastRenderedPageBreak/>
         <w:t>Leistungen</w:t>
       </w:r>
       <w:r>
@@ -1574,7 +1577,6 @@
             <w14:uncheckedState w14:val="2610" w14:font="MS Gothic"/>
           </w14:checkbox>
         </w:sdtPr>
-        <w:sdtEndPr/>
         <w:sdtContent>
           <w:r>
             <w:rPr>
@@ -1621,7 +1623,6 @@
             <w14:uncheckedState w14:val="2610" w14:font="MS Gothic"/>
           </w14:checkbox>
         </w:sdtPr>
-        <w:sdtEndPr/>
         <w:sdtContent>
           <w:r>
             <w:rPr>
@@ -1661,7 +1662,6 @@
             <w14:uncheckedState w14:val="2610" w14:font="MS Gothic"/>
           </w14:checkbox>
         </w:sdtPr>
-        <w:sdtEndPr/>
         <w:sdtContent>
           <w:r>
             <w:rPr>
@@ -1698,7 +1698,6 @@
             <w14:uncheckedState w14:val="2610" w14:font="MS Gothic"/>
           </w14:checkbox>
         </w:sdtPr>
-        <w:sdtEndPr/>
         <w:sdtContent>
           <w:r>
             <w:rPr>
@@ -1891,7 +1890,6 @@
             <w14:uncheckedState w14:val="2610" w14:font="MS Gothic"/>
           </w14:checkbox>
         </w:sdtPr>
-        <w:sdtEndPr/>
         <w:sdtContent>
           <w:r>
             <w:rPr>
@@ -1923,7 +1921,6 @@
             <w14:uncheckedState w14:val="2610" w14:font="MS Gothic"/>
           </w14:checkbox>
         </w:sdtPr>
-        <w:sdtEndPr/>
         <w:sdtContent>
           <w:r>
             <w:rPr>
@@ -1945,7 +1942,6 @@
             <w14:uncheckedState w14:val="2610" w14:font="MS Gothic"/>
           </w14:checkbox>
         </w:sdtPr>
-        <w:sdtEndPr/>
         <w:sdtContent>
           <w:r>
             <w:rPr>
@@ -1967,7 +1963,6 @@
             <w14:uncheckedState w14:val="2610" w14:font="MS Gothic"/>
           </w14:checkbox>
         </w:sdtPr>
-        <w:sdtEndPr/>
         <w:sdtContent>
           <w:r>
             <w:rPr>
@@ -2004,7 +1999,6 @@
             <w14:uncheckedState w14:val="2610" w14:font="MS Gothic"/>
           </w14:checkbox>
         </w:sdtPr>
-        <w:sdtEndPr/>
         <w:sdtContent>
           <w:r>
             <w:rPr>
@@ -2035,7 +2029,6 @@
             <w14:uncheckedState w14:val="2610" w14:font="MS Gothic"/>
           </w14:checkbox>
         </w:sdtPr>
-        <w:sdtEndPr/>
         <w:sdtContent>
           <w:r>
             <w:rPr>
@@ -2072,7 +2065,6 @@
             <w14:uncheckedState w14:val="2610" w14:font="MS Gothic"/>
           </w14:checkbox>
         </w:sdtPr>
-        <w:sdtEndPr/>
         <w:sdtContent>
           <w:r>
             <w:rPr>
@@ -2317,7 +2309,6 @@
             <w14:uncheckedState w14:val="2610" w14:font="MS Gothic"/>
           </w14:checkbox>
         </w:sdtPr>
-        <w:sdtEndPr/>
         <w:sdtContent>
           <w:r>
             <w:rPr>
@@ -2371,7 +2362,6 @@
             <w14:uncheckedState w14:val="2610" w14:font="MS Gothic"/>
           </w14:checkbox>
         </w:sdtPr>
-        <w:sdtEndPr/>
         <w:sdtContent>
           <w:r>
             <w:rPr>
@@ -2408,7 +2398,6 @@
             <w14:uncheckedState w14:val="2610" w14:font="MS Gothic"/>
           </w14:checkbox>
         </w:sdtPr>
-        <w:sdtEndPr/>
         <w:sdtContent>
           <w:r>
             <w:rPr>
@@ -2445,7 +2434,6 @@
             <w14:uncheckedState w14:val="2610" w14:font="MS Gothic"/>
           </w14:checkbox>
         </w:sdtPr>
-        <w:sdtEndPr/>
         <w:sdtContent>
           <w:r>
             <w:rPr>
@@ -2482,7 +2470,6 @@
             <w14:uncheckedState w14:val="2610" w14:font="MS Gothic"/>
           </w14:checkbox>
         </w:sdtPr>
-        <w:sdtEndPr/>
         <w:sdtContent>
           <w:r>
             <w:rPr>
@@ -2528,7 +2515,6 @@
             <w14:uncheckedState w14:val="2610" w14:font="MS Gothic"/>
           </w14:checkbox>
         </w:sdtPr>
-        <w:sdtEndPr/>
         <w:sdtContent>
           <w:r>
             <w:rPr>
@@ -2585,6 +2571,7 @@
           <w:iCs/>
           <w:lang w:eastAsia="de-CH"/>
         </w:rPr>
+        <w:lastRenderedPageBreak/>
         <w:t xml:space="preserve">Dokumentationen von Liegenschaften wie z. Bsp. Zufahrtsstrassen o.Ä., welche diverse Eigentümer aufweisen, werden nicht </w:t>
       </w:r>
       <w:r>
@@ -2625,7 +2612,6 @@
           <w:caps/>
           <w:sz w:val="22"/>
         </w:rPr>
-        <w:lastRenderedPageBreak/>
         <w:t>KOSTEN</w:t>
       </w:r>
     </w:p>
@@ -2846,10 +2832,8 @@
               <w:spacing w:before="20" w:after="20"/>
               <w:ind w:right="412"/>
               <w:jc w:val="right"/>
-              <w:rPr/>
             </w:pPr>
             <w:r>
-              <w:rPr/>
               <w:t>{{PREIS_LEISTUNG}}</w:t>
             </w:r>
           </w:p>
@@ -3123,13 +3107,27 @@
               <w:rPr>
                 <w:b/>
               </w:rPr>
-              <w:t>{{TOTAL_1}}</w:t>
-            </w:r>
+              <w:t>{{TOTAL_1</w:t>
+            </w:r>
+            <w:proofErr w:type="gramStart"/>
             <w:r>
               <w:rPr>
                 <w:b/>
               </w:rPr>
-              <w:t xml:space="preserve">{{TOTAL_2}}</w:t>
+              <w:t>}}</w:t>
+            </w:r>
+            <w:r>
+              <w:rPr>
+                <w:b/>
+              </w:rPr>
+              <w:t>{</w:t>
+            </w:r>
+            <w:proofErr w:type="gramEnd"/>
+            <w:r>
+              <w:rPr>
+                <w:b/>
+              </w:rPr>
+              <w:t>{TOTAL_2}}</w:t>
             </w:r>
             <w:r>
               <w:rPr>
@@ -3204,10 +3202,8 @@
         </w:numPr>
         <w:spacing w:after="60"/>
         <w:ind w:left="567"/>
-        <w:rPr/>
-      </w:pPr>
-      <w:r>
-        <w:rPr/>
+      </w:pPr>
+      <w:r>
         <w:t>Die Aufnahmen werden in Absprache mit dem Auftraggeber durchgeführt.</w:t>
       </w:r>
     </w:p>
@@ -3220,18 +3216,14 @@
         </w:numPr>
         <w:spacing w:after="60"/>
         <w:ind w:left="567"/>
-        <w:rPr/>
-      </w:pPr>
-      <w:r>
-        <w:rPr/>
+      </w:pPr>
+      <w:r>
         <w:t>Um eine vollständige und reibungslose Organisation zu gewährleisten, wir</w:t>
       </w:r>
       <w:r>
-        <w:rPr/>
         <w:t>d</w:t>
       </w:r>
       <w:r>
-        <w:rPr/>
         <w:t xml:space="preserve"> eine Vorlaufzeit von </w:t>
       </w:r>
       <w:r>
@@ -3241,15 +3233,12 @@
         <w:t>mindestens {{VORLAUFZEIT}}</w:t>
       </w:r>
       <w:r>
-        <w:rPr/>
         <w:t xml:space="preserve"> benötigt</w:t>
       </w:r>
       <w:r>
-        <w:rPr/>
         <w:t>, um die gewünschten Aufnahmen zu terminieren</w:t>
       </w:r>
       <w:r>
-        <w:rPr/>
         <w:t>. Dies wird gemäss Erfahrung auch seitens der Eigentümer/Verwaltungen vorausgesetzt.</w:t>
       </w:r>
     </w:p>
@@ -3262,10 +3251,8 @@
         </w:numPr>
         <w:spacing w:after="60"/>
         <w:ind w:left="567"/>
-        <w:rPr/>
-      </w:pPr>
-      <w:r>
-        <w:rPr/>
+      </w:pPr>
+      <w:r>
         <w:t>Offertgültigkeit: 90 Tage</w:t>
       </w:r>
     </w:p>
@@ -3301,7 +3288,6 @@
         </w:numPr>
         <w:spacing w:after="60"/>
         <w:ind w:left="567"/>
-        <w:rPr/>
       </w:pPr>
       <w:r>
         <w:t xml:space="preserve">Der Auftraggeber nimmt zur Kenntnis, dass die HMQ AG als Auftragnehmerin personenbezogene Daten verarbeitet, soweit dies im Rahmen der Anfrage erforderlich ist. Der Auftraggeber bestätigt mit der Auftragserteilung die </w:t>
@@ -3462,16 +3448,16 @@
           <w:lang w:eastAsia="de-CH"/>
         </w:rPr>
         <w:drawing>
-          <wp:anchor distT="0" distB="0" distL="114300" distR="114300" simplePos="0" relativeHeight="251658240" behindDoc="1" locked="0" layoutInCell="1" allowOverlap="1" wp14:anchorId="39011E0D" wp14:editId="7AEAA8D1">
+          <wp:anchor distT="0" distB="0" distL="114300" distR="114300" simplePos="0" relativeHeight="251658240" behindDoc="1" locked="0" layoutInCell="1" allowOverlap="1" wp14:anchorId="39011E0D" wp14:editId="7409F439">
             <wp:simplePos x="0" y="0"/>
             <wp:positionH relativeFrom="column">
-              <wp:posOffset>2014220</wp:posOffset>
+              <wp:posOffset>2095424</wp:posOffset>
             </wp:positionH>
             <wp:positionV relativeFrom="paragraph">
-              <wp:posOffset>76200</wp:posOffset>
+              <wp:posOffset>78740</wp:posOffset>
             </wp:positionV>
-            <wp:extent cx="1990725" cy="582997"/>
-            <wp:effectExtent l="0" t="0" r="0" b="0"/>
+            <wp:extent cx="1348180" cy="582997"/>
+            <wp:effectExtent l="0" t="0" r="4445" b="7620"/>
             <wp:wrapNone/>
             <wp:docPr id="28" name="Grafik 28"/>
             <wp:cNvGraphicFramePr>
@@ -3487,7 +3473,7 @@
                     </pic:cNvPicPr>
                   </pic:nvPicPr>
                   <pic:blipFill>
-                    <a:blip r:embed="rId10" cstate="print">
+                    <a:blip r:embed="rId10">
                       <a:extLst>
                         <a:ext uri="{28A0092B-C50C-407E-A947-70E740481C1C}">
                           <a14:useLocalDpi xmlns:a14="http://schemas.microsoft.com/office/drawing/2010/main" val="0"/>
@@ -3501,7 +3487,7 @@
                   <pic:spPr bwMode="auto">
                     <a:xfrm>
                       <a:off x="0" y="0"/>
-                      <a:ext cx="1990725" cy="582997"/>
+                      <a:ext cx="1348180" cy="582997"/>
                     </a:xfrm>
                     <a:prstGeom prst="rect">
                       <a:avLst/>
@@ -3629,7 +3615,7 @@
         <w:rPr>
           <w:spacing w:val="-3"/>
         </w:rPr>
-        <w:t>Bianca Hochuli</w:t>
+        <w:t>Moreno Meier</w:t>
       </w:r>
     </w:p>
     <w:p>
@@ -3661,12 +3647,21 @@
         </w:rPr>
         <w:tab/>
       </w:r>
+      <w:proofErr w:type="spellStart"/>
       <w:r>
         <w:rPr>
           <w:sz w:val="16"/>
           <w:szCs w:val="16"/>
         </w:rPr>
-        <w:t>Kauffrau EFZ</w:t>
+        <w:t>BSc</w:t>
+      </w:r>
+      <w:proofErr w:type="spellEnd"/>
+      <w:r>
+        <w:rPr>
+          <w:sz w:val="16"/>
+          <w:szCs w:val="16"/>
+        </w:rPr>
+        <w:t xml:space="preserve"> FHNW in Geomatik</w:t>
       </w:r>
     </w:p>
     <w:p>
@@ -3712,21 +3707,12 @@
         </w:rPr>
         <w:tab/>
       </w:r>
-      <w:proofErr w:type="spellStart"/>
       <w:r>
         <w:rPr>
           <w:sz w:val="16"/>
           <w:szCs w:val="16"/>
         </w:rPr>
-        <w:t>Stv</w:t>
-      </w:r>
-      <w:proofErr w:type="spellEnd"/>
-      <w:r>
-        <w:rPr>
-          <w:sz w:val="16"/>
-          <w:szCs w:val="16"/>
-        </w:rPr>
-        <w:t>. Bereichsleitung Beweissicherung</w:t>
+        <w:t>Geschäftsstellenleitung Zürich</w:t>
       </w:r>
     </w:p>
     <w:bookmarkEnd w:id="3"/>
@@ -3887,7 +3873,7 @@
                     <pic:cNvPicPr/>
                   </pic:nvPicPr>
                   <pic:blipFill>
-                    <a:blip r:embed="{{PLAN_RID}}">
+                    <a:blip>
                       <a:extLst>
                         <a:ext uri="{28A0092B-C50C-407E-A947-70E740481C1C}">
                           <a14:useLocalDpi xmlns:a14="http://schemas.microsoft.com/office/drawing/2010/main" val="0"/>
@@ -4073,7 +4059,7 @@
           </mc:Choice>
           <mc:Fallback>
             <w:pict>
-              <v:shape w14:anchorId="4F9BE48B" id="Freihandform 82" o:spid="_x0000_s1026" style="position:absolute;margin-left:10.55pt;margin-top:551.75pt;width:25.3pt;height:9.2pt;z-index:251690496;visibility:visible;mso-wrap-style:square;mso-height-percent:0;mso-wrap-distance-left:9pt;mso-wrap-distance-top:0;mso-wrap-distance-right:9pt;mso-wrap-distance-bottom:0;mso-position-horizontal:absolute;mso-position-horizontal-relative:text;mso-position-vertical:absolute;mso-position-vertical-relative:text;mso-height-percent:0;mso-height-relative:margin;v-text-anchor:middle" coordsize="321869,117043" o:gfxdata="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" path="m36576,l321869,29261r-21946,87782l,95098,36576,xe" fillcolor="#fabf8f [1945]" stroked="f" strokeweight="2pt">
+              <v:shape w14:anchorId="160230AD" id="Freihandform 82" o:spid="_x0000_s1026" style="position:absolute;margin-left:10.55pt;margin-top:551.75pt;width:25.3pt;height:9.2pt;z-index:251690496;visibility:visible;mso-wrap-style:square;mso-height-percent:0;mso-wrap-distance-left:9pt;mso-wrap-distance-top:0;mso-wrap-distance-right:9pt;mso-wrap-distance-bottom:0;mso-position-horizontal:absolute;mso-position-horizontal-relative:text;mso-position-vertical:absolute;mso-position-vertical-relative:text;mso-height-percent:0;mso-height-relative:margin;v-text-anchor:middle" coordsize="321869,117043" o:gfxdata="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" path="m36576,l321869,29261r-21946,87782l,95098,36576,xe" fillcolor="#fabf8f [1945]" stroked="f" strokeweight="2pt">
                 <v:fill opacity="39321f"/>
                 <v:path arrowok="t" o:connecttype="custom" o:connectlocs="36512,0;321310,29210;299402,116840;0,94933;36512,0" o:connectangles="0,0,0,0,0"/>
               </v:shape>
@@ -4180,7 +4166,7 @@
           </mc:Choice>
           <mc:Fallback>
             <w:pict>
-              <v:shape w14:anchorId="1DCE209B" id="Freihandform 37" o:spid="_x0000_s1026" style="position:absolute;margin-left:10.35pt;margin-top:516.1pt;width:27.6pt;height:0;z-index:251674112;visibility:visible;mso-wrap-style:square;mso-wrap-distance-left:9pt;mso-wrap-distance-top:0;mso-wrap-distance-right:9pt;mso-wrap-distance-bottom:0;mso-position-horizontal:absolute;mso-position-horizontal-relative:text;mso-position-vertical:absolute;mso-position-vertical-relative:text;v-text-anchor:middle" coordsize="351129,0" o:gfxdata="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" path="m,l351129,e" filled="f" strokecolor="red" strokeweight="4pt">
+              <v:shape w14:anchorId="3CAF238A" id="Freihandform 37" o:spid="_x0000_s1026" style="position:absolute;margin-left:10.35pt;margin-top:516.1pt;width:27.6pt;height:0;z-index:251674112;visibility:visible;mso-wrap-style:square;mso-wrap-distance-left:9pt;mso-wrap-distance-top:0;mso-wrap-distance-right:9pt;mso-wrap-distance-bottom:0;mso-position-horizontal:absolute;mso-position-horizontal-relative:text;mso-position-vertical:absolute;mso-position-vertical-relative:text;v-text-anchor:middle" coordsize="351129,0" o:gfxdata="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" path="m,l351129,e" filled="f" strokecolor="red" strokeweight="4pt">
                 <v:stroke opacity="39321f"/>
                 <v:path arrowok="t" o:connecttype="custom" o:connectlocs="0,0;350520,0" o:connectangles="0,0"/>
               </v:shape>
@@ -4342,7 +4328,7 @@
           </mc:Choice>
           <mc:Fallback>
             <w:pict>
-              <v:shape w14:anchorId="6C882835" id="Freihandform 36" o:spid="_x0000_s1026" style="position:absolute;margin-left:11.6pt;margin-top:527.8pt;width:28.2pt;height:17.2pt;z-index:251657728;visibility:visible;mso-wrap-style:square;mso-width-percent:0;mso-height-percent:0;mso-wrap-distance-left:9pt;mso-wrap-distance-top:0;mso-wrap-distance-right:9pt;mso-wrap-distance-bottom:0;mso-position-horizontal:absolute;mso-position-horizontal-relative:text;mso-position-vertical:absolute;mso-position-vertical-relative:text;mso-width-percent:0;mso-height-percent:0;mso-width-relative:margin;mso-height-relative:margin;v-text-anchor:middle" coordsize="526694,811987" o:gfxdata="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" path="m416966,l526694,175565,263347,299923r65837,490119l102413,811987,65837,475488,,197511,416966,xe" fillcolor="#4f81bd [3204]" stroked="f" strokeweight="2pt">
+              <v:shape w14:anchorId="362E3CBC" id="Freihandform 36" o:spid="_x0000_s1026" style="position:absolute;margin-left:11.6pt;margin-top:527.8pt;width:28.2pt;height:17.2pt;z-index:251657728;visibility:visible;mso-wrap-style:square;mso-width-percent:0;mso-height-percent:0;mso-wrap-distance-left:9pt;mso-wrap-distance-top:0;mso-wrap-distance-right:9pt;mso-wrap-distance-bottom:0;mso-position-horizontal:absolute;mso-position-horizontal-relative:text;mso-position-vertical:absolute;mso-position-vertical-relative:text;mso-width-percent:0;mso-height-percent:0;mso-width-relative:margin;mso-height-relative:margin;v-text-anchor:middle" coordsize="526694,811987" o:gfxdata="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" path="m416966,l526694,175565,263347,299923r65837,490119l102413,811987,65837,475488,,197511,416966,xe" fillcolor="#4f81bd [3204]" stroked="f" strokeweight="2pt">
                 <v:fill opacity="39321f"/>
                 <v:path arrowok="t" o:connecttype="custom" o:connectlocs="283527,0;358140,47230;179070,80685;223838,212536;69639,218440;44768,127915;0,53134;283527,0" o:connectangles="0,0,0,0,0,0,0,0"/>
               </v:shape>
@@ -4554,12 +4540,12 @@
       </w:r>
     </w:p>
     <w:sectPr>
-      <w:headerReference w:type="even" r:id="rId13"/>
-      <w:headerReference w:type="default" r:id="rId14"/>
-      <w:footerReference w:type="even" r:id="rId15"/>
-      <w:footerReference w:type="default" r:id="rId16"/>
-      <w:headerReference w:type="first" r:id="rId17"/>
-      <w:footerReference w:type="first" r:id="rId18"/>
+      <w:headerReference w:type="even" r:id="rId12"/>
+      <w:headerReference w:type="default" r:id="rId13"/>
+      <w:footerReference w:type="even" r:id="rId14"/>
+      <w:footerReference w:type="default" r:id="rId15"/>
+      <w:headerReference w:type="first" r:id="rId16"/>
+      <w:footerReference w:type="first" r:id="rId17"/>
       <w:pgSz w:w="11907" w:h="16840" w:code="9"/>
       <w:pgMar w:top="1387" w:right="1418" w:bottom="1134" w:left="1418" w:header="720" w:footer="720" w:gutter="0"/>
       <w:cols w:space="720"/>
@@ -4747,7 +4733,7 @@
         <v:path o:extrusionok="f" gradientshapeok="t" o:connecttype="rect"/>
         <o:lock v:ext="edit" aspectratio="t"/>
       </v:shapetype>
-      <v:shape id="_x0000_i1026" type="#_x0000_t75" style="width:17.25pt;height:9.75pt;visibility:visible;mso-wrap-style:square" o:bullet="t">
+      <v:shape id="_x0000_i1025" type="#_x0000_t75" style="width:17pt;height:9.5pt;visibility:visible;mso-wrap-style:square" o:bullet="t">
         <v:imagedata r:id="rId1" o:title=""/>
       </v:shape>
     </w:pict>
@@ -7374,11 +7360,13 @@
   <w:rsids>
     <w:rsidRoot w:val="005707D9"/>
     <w:rsid w:val="001A7E60"/>
+    <w:rsid w:val="00210D17"/>
     <w:rsid w:val="003A0788"/>
     <w:rsid w:val="003F29AA"/>
     <w:rsid w:val="00411F4E"/>
     <w:rsid w:val="00473398"/>
     <w:rsid w:val="005707D9"/>
+    <w:rsid w:val="007D2720"/>
     <w:rsid w:val="00852597"/>
     <w:rsid w:val="008565CC"/>
     <w:rsid w:val="008639DB"/>

</xml_diff>

<commit_message>
Revert "fix: Ansprechpartner Bianca Hochuli durch Moreno Meier ersetzen"
</commit_message>
<xml_diff>
--- a/hmq-offerten/public/Offerte_Template_V11.docx
+++ b/hmq-offerten/public/Offerte_Template_V11.docx
@@ -134,6 +134,7 @@
                   <w:listItem w:displayText="Voa la Schena 2 · 7077 Valbella" w:value="Voa la Schena 2 · 7077 Valbella"/>
                 </w:dropDownList>
               </w:sdtPr>
+              <w:sdtEndPr/>
               <w:sdtContent>
                 <w:r>
                   <w:rPr>
@@ -186,40 +187,59 @@
             </w:tcBorders>
           </w:tcPr>
           <w:p>
-            <w:r>
+            <w:pPr>
+              <w:rPr/>
+            </w:pPr>
+            <w:r>
+              <w:rPr/>
               <w:t>{{FIRMA}}</w:t>
+            </w:r>
+          </w:p>
+          <w:p w14:paraId="ABT00001">
+            <w:pPr>
+              <w:rPr/>
+            </w:pPr>
+            <w:r>
+              <w:rPr/>
+              <w:t>{{ABTEILUNG}}</w:t>
             </w:r>
           </w:p>
           <w:p>
-            <w:r>
-              <w:t>{{ABTEILUNG}}</w:t>
+            <w:pPr>
+              <w:rPr/>
+            </w:pPr>
+            <w:r>
+              <w:rPr/>
+              <w:t>{{KONTAKT_ZEILE}}</w:t>
             </w:r>
           </w:p>
           <w:p>
-            <w:r>
-              <w:t>{{KONTAKT_ZEILE}}</w:t>
+            <w:pPr>
+              <w:rPr/>
+            </w:pPr>
+            <w:proofErr w:type="spellStart"/>
+            <w:r>
+              <w:rPr/>
+              <w:t>{{FUNKTION_1}}</w:t>
+            </w:r>
+            <w:proofErr w:type="spellEnd"/>
+            <w:r>
+              <w:rPr/>
+              <w:t xml:space="preserve">{{FUNKTION_2}}</w:t>
             </w:r>
           </w:p>
           <w:p>
-            <w:r>
-              <w:t>{{FUNKTION_1</w:t>
-            </w:r>
-            <w:proofErr w:type="gramStart"/>
-            <w:r>
-              <w:t>}}{</w:t>
-            </w:r>
-            <w:proofErr w:type="gramEnd"/>
-            <w:r>
-              <w:t>{FUNKTION_2}}</w:t>
+            <w:pPr>
+              <w:rPr/>
+            </w:pPr>
+            <w:r>
+              <w:rPr/>
+              <w:t>{{STRASSE}}</w:t>
             </w:r>
           </w:p>
           <w:p>
             <w:r>
-              <w:t>{{STRASSE}}</w:t>
-            </w:r>
-          </w:p>
-          <w:p>
-            <w:r>
+              <w:rPr/>
               <w:t>{{PLZ_ORT}}</w:t>
             </w:r>
           </w:p>
@@ -256,6 +276,7 @@
           <w:p>
             <w:sdt>
               <w:sdtPr>
+                <w:rPr/>
                 <w:alias w:val="Bürostandort"/>
                 <w:tag w:val="Bürostandort"/>
                 <w:id w:val="2130127238"/>
@@ -271,18 +292,24 @@
                   <w:listItem w:displayText="Valbella" w:value="Valbella"/>
                 </w:dropDownList>
               </w:sdtPr>
+              <w:sdtEndPr/>
               <w:sdtContent>
                 <w:r>
+                  <w:rPr/>
                   <w:t>{{STANDORT}}</w:t>
                 </w:r>
               </w:sdtContent>
             </w:sdt>
             <w:r>
+              <w:rPr/>
               <w:t xml:space="preserve">, </w:t>
             </w:r>
-            <w:r>
+            <w:proofErr w:type="spellStart"/>
+            <w:r>
+              <w:rPr/>
               <w:t>{{DATUM}}</w:t>
             </w:r>
+            <w:proofErr w:type="spellEnd"/>
           </w:p>
         </w:tc>
       </w:tr>
@@ -330,76 +357,28 @@
                 <w:b/>
                 <w:sz w:val="22"/>
               </w:rPr>
-              <w:t>{{OFFNR_A</w:t>
-            </w:r>
-            <w:proofErr w:type="gramStart"/>
+              <w:t>{{OFFNR_A}}</w:t>
+            </w:r>
             <w:r>
               <w:rPr>
                 <w:b/>
                 <w:sz w:val="22"/>
               </w:rPr>
-              <w:t>}}</w:t>
+              <w:t>{{OFFNR_B}}</w:t>
             </w:r>
             <w:r>
               <w:rPr>
                 <w:b/>
                 <w:sz w:val="22"/>
               </w:rPr>
-              <w:t>{</w:t>
-            </w:r>
-            <w:proofErr w:type="gramEnd"/>
+              <w:t>{{OFFNR_C}}</w:t>
+            </w:r>
             <w:r>
               <w:rPr>
                 <w:b/>
                 <w:sz w:val="22"/>
               </w:rPr>
-              <w:t>{OFFNR_B</w:t>
-            </w:r>
-            <w:proofErr w:type="gramStart"/>
-            <w:r>
-              <w:rPr>
-                <w:b/>
-                <w:sz w:val="22"/>
-              </w:rPr>
-              <w:t>}}</w:t>
-            </w:r>
-            <w:r>
-              <w:rPr>
-                <w:b/>
-                <w:sz w:val="22"/>
-              </w:rPr>
-              <w:t>{</w:t>
-            </w:r>
-            <w:proofErr w:type="gramEnd"/>
-            <w:r>
-              <w:rPr>
-                <w:b/>
-                <w:sz w:val="22"/>
-              </w:rPr>
-              <w:t>{OFFNR_C</w:t>
-            </w:r>
-            <w:proofErr w:type="gramStart"/>
-            <w:r>
-              <w:rPr>
-                <w:b/>
-                <w:sz w:val="22"/>
-              </w:rPr>
-              <w:t>}}</w:t>
-            </w:r>
-            <w:r>
-              <w:rPr>
-                <w:b/>
-                <w:sz w:val="22"/>
-              </w:rPr>
-              <w:t>{</w:t>
-            </w:r>
-            <w:proofErr w:type="gramEnd"/>
-            <w:r>
-              <w:rPr>
-                <w:b/>
-                <w:sz w:val="22"/>
-              </w:rPr>
-              <w:t>{OFFNR_D}}: Offerte für Beweissicherung</w:t>
+              <w:t>{{OFFNR_D}}: Offerte für Beweissicherung</w:t>
             </w:r>
           </w:p>
         </w:tc>
@@ -434,23 +413,23 @@
                 <w:b/>
                 <w:sz w:val="22"/>
               </w:rPr>
-              <w:t>{{PROJEKT_ORT}}, {{PROJEKT_BEZ1</w:t>
-            </w:r>
-            <w:proofErr w:type="gramStart"/>
+              <w:t xml:space="preserve">{{PROJEKT_ORT}}, </w:t>
+            </w:r>
+            <w:proofErr w:type="spellStart"/>
             <w:r>
               <w:rPr>
                 <w:b/>
                 <w:sz w:val="22"/>
               </w:rPr>
-              <w:t>}}{</w:t>
-            </w:r>
-            <w:proofErr w:type="gramEnd"/>
+              <w:t>{{PROJEKT_BEZ1}}</w:t>
+            </w:r>
+            <w:proofErr w:type="spellEnd"/>
             <w:r>
               <w:rPr>
                 <w:b/>
                 <w:sz w:val="22"/>
               </w:rPr>
-              <w:t>{PROJEKT_BEZ2}}</w:t>
+              <w:t xml:space="preserve">{{PROJEKT_BEZ2}}</w:t>
             </w:r>
           </w:p>
         </w:tc>
@@ -489,6 +468,7 @@
           </w:tcPr>
           <w:p>
             <w:r>
+              <w:rPr/>
               <w:t>{{ANREDE}}</w:t>
             </w:r>
           </w:p>
@@ -542,26 +522,23 @@
               <w:t xml:space="preserve">Ihre Anfrage vom </w:t>
             </w:r>
             <w:r>
-              <w:t>{{ANF_TAG</w:t>
-            </w:r>
-            <w:proofErr w:type="gramStart"/>
-            <w:r>
-              <w:t>}}</w:t>
-            </w:r>
-            <w:r>
-              <w:t>{</w:t>
-            </w:r>
-            <w:proofErr w:type="gramEnd"/>
-            <w:r>
-              <w:t>{ANF_MONAT}}</w:t>
-            </w:r>
-            <w:r>
+              <w:rPr/>
+              <w:t xml:space="preserve">{{ANF_TAG}}</w:t>
+            </w:r>
+            <w:r>
+              <w:rPr/>
+              <w:t>{{ANF_MONAT}}</w:t>
+            </w:r>
+            <w:r>
+              <w:rPr/>
               <w:t xml:space="preserve"> 20</w:t>
             </w:r>
             <w:r>
+              <w:rPr/>
               <w:t>2</w:t>
             </w:r>
             <w:r>
+              <w:rPr/>
               <w:t>5</w:t>
             </w:r>
             <w:r>
@@ -701,6 +678,7 @@
                   <w14:uncheckedState w14:val="2610" w14:font="MS Gothic"/>
                 </w14:checkbox>
               </w:sdtPr>
+              <w:sdtEndPr/>
               <w:sdtContent>
                 <w:r>
                   <w:rPr>
@@ -729,6 +707,7 @@
                   <w14:uncheckedState w14:val="2610" w14:font="MS Gothic"/>
                 </w14:checkbox>
               </w:sdtPr>
+              <w:sdtEndPr/>
               <w:sdtContent>
                 <w:r>
                   <w:rPr>
@@ -753,6 +732,7 @@
                   <w14:uncheckedState w14:val="2610" w14:font="MS Gothic"/>
                 </w14:checkbox>
               </w:sdtPr>
+              <w:sdtEndPr/>
               <w:sdtContent>
                 <w:r>
                   <w:rPr>
@@ -780,6 +760,7 @@
                   <w14:uncheckedState w14:val="2610" w14:font="MS Gothic"/>
                 </w14:checkbox>
               </w:sdtPr>
+              <w:sdtEndPr/>
               <w:sdtContent>
                 <w:r>
                   <w:rPr>
@@ -823,6 +804,7 @@
                   <w14:uncheckedState w14:val="2610" w14:font="MS Gothic"/>
                 </w14:checkbox>
               </w:sdtPr>
+              <w:sdtEndPr/>
               <w:sdtContent>
                 <w:r>
                   <w:rPr>
@@ -854,6 +836,7 @@
                   <w14:uncheckedState w14:val="2610" w14:font="MS Gothic"/>
                 </w14:checkbox>
               </w:sdtPr>
+              <w:sdtEndPr/>
               <w:sdtContent>
                 <w:r>
                   <w:rPr>
@@ -894,6 +877,7 @@
                   <w14:uncheckedState w14:val="2610" w14:font="MS Gothic"/>
                 </w14:checkbox>
               </w:sdtPr>
+              <w:sdtEndPr/>
               <w:sdtContent>
                 <w:r>
                   <w:rPr>
@@ -924,6 +908,7 @@
                   <w14:uncheckedState w14:val="2610" w14:font="MS Gothic"/>
                 </w14:checkbox>
               </w:sdtPr>
+              <w:sdtEndPr/>
               <w:sdtContent>
                 <w:r>
                   <w:rPr>
@@ -967,6 +952,7 @@
                   <w14:uncheckedState w14:val="2610" w14:font="MS Gothic"/>
                 </w14:checkbox>
               </w:sdtPr>
+              <w:sdtEndPr/>
               <w:sdtContent>
                 <w:r>
                   <w:rPr>
@@ -991,6 +977,7 @@
                   <w14:uncheckedState w14:val="2610" w14:font="MS Gothic"/>
                 </w14:checkbox>
               </w:sdtPr>
+              <w:sdtEndPr/>
               <w:sdtContent>
                 <w:r>
                   <w:rPr>
@@ -1028,6 +1015,7 @@
                   <w14:uncheckedState w14:val="2610" w14:font="MS Gothic"/>
                 </w14:checkbox>
               </w:sdtPr>
+              <w:sdtEndPr/>
               <w:sdtContent>
                 <w:r>
                   <w:rPr>
@@ -1052,6 +1040,7 @@
                   <w14:uncheckedState w14:val="2610" w14:font="MS Gothic"/>
                 </w14:checkbox>
               </w:sdtPr>
+              <w:sdtEndPr/>
               <w:sdtContent>
                 <w:r>
                   <w:rPr>
@@ -1160,6 +1149,7 @@
                   <w14:uncheckedState w14:val="2610" w14:font="MS Gothic"/>
                 </w14:checkbox>
               </w:sdtPr>
+              <w:sdtEndPr/>
               <w:sdtContent>
                 <w:r>
                   <w:rPr>
@@ -1188,6 +1178,7 @@
                   <w14:uncheckedState w14:val="2610" w14:font="MS Gothic"/>
                 </w14:checkbox>
               </w:sdtPr>
+              <w:sdtEndPr/>
               <w:sdtContent>
                 <w:r>
                   <w:rPr>
@@ -1231,6 +1222,7 @@
                   <w14:uncheckedState w14:val="2610" w14:font="MS Gothic"/>
                 </w14:checkbox>
               </w:sdtPr>
+              <w:sdtEndPr/>
               <w:sdtContent>
                 <w:r>
                   <w:rPr>
@@ -1258,6 +1250,7 @@
                   <w14:uncheckedState w14:val="2610" w14:font="MS Gothic"/>
                 </w14:checkbox>
               </w:sdtPr>
+              <w:sdtEndPr/>
               <w:sdtContent>
                 <w:r>
                   <w:rPr>
@@ -1301,6 +1294,7 @@
                   <w14:uncheckedState w14:val="2610" w14:font="MS Gothic"/>
                 </w14:checkbox>
               </w:sdtPr>
+              <w:sdtEndPr/>
               <w:sdtContent>
                 <w:r>
                   <w:rPr>
@@ -1337,6 +1331,7 @@
                   <w14:uncheckedState w14:val="2610" w14:font="MS Gothic"/>
                 </w14:checkbox>
               </w:sdtPr>
+              <w:sdtEndPr/>
               <w:sdtContent>
                 <w:r>
                   <w:rPr>
@@ -1376,6 +1371,7 @@
                   <w14:uncheckedState w14:val="2610" w14:font="MS Gothic"/>
                 </w14:checkbox>
               </w:sdtPr>
+              <w:sdtEndPr/>
               <w:sdtContent>
                 <w:r>
                   <w:rPr>
@@ -1403,6 +1399,7 @@
                   <w14:uncheckedState w14:val="2610" w14:font="MS Gothic"/>
                 </w14:checkbox>
               </w:sdtPr>
+              <w:sdtEndPr/>
               <w:sdtContent>
                 <w:r>
                   <w:rPr>
@@ -1439,7 +1436,6 @@
           <w:caps/>
           <w:sz w:val="22"/>
         </w:rPr>
-        <w:lastRenderedPageBreak/>
         <w:br w:type="textWrapping" w:clear="all"/>
       </w:r>
     </w:p>
@@ -1463,6 +1459,7 @@
           <w:caps/>
           <w:sz w:val="22"/>
         </w:rPr>
+        <w:lastRenderedPageBreak/>
         <w:t>Leistungen</w:t>
       </w:r>
       <w:r>
@@ -1577,6 +1574,7 @@
             <w14:uncheckedState w14:val="2610" w14:font="MS Gothic"/>
           </w14:checkbox>
         </w:sdtPr>
+        <w:sdtEndPr/>
         <w:sdtContent>
           <w:r>
             <w:rPr>
@@ -1623,6 +1621,7 @@
             <w14:uncheckedState w14:val="2610" w14:font="MS Gothic"/>
           </w14:checkbox>
         </w:sdtPr>
+        <w:sdtEndPr/>
         <w:sdtContent>
           <w:r>
             <w:rPr>
@@ -1662,6 +1661,7 @@
             <w14:uncheckedState w14:val="2610" w14:font="MS Gothic"/>
           </w14:checkbox>
         </w:sdtPr>
+        <w:sdtEndPr/>
         <w:sdtContent>
           <w:r>
             <w:rPr>
@@ -1698,6 +1698,7 @@
             <w14:uncheckedState w14:val="2610" w14:font="MS Gothic"/>
           </w14:checkbox>
         </w:sdtPr>
+        <w:sdtEndPr/>
         <w:sdtContent>
           <w:r>
             <w:rPr>
@@ -1890,6 +1891,7 @@
             <w14:uncheckedState w14:val="2610" w14:font="MS Gothic"/>
           </w14:checkbox>
         </w:sdtPr>
+        <w:sdtEndPr/>
         <w:sdtContent>
           <w:r>
             <w:rPr>
@@ -1921,6 +1923,7 @@
             <w14:uncheckedState w14:val="2610" w14:font="MS Gothic"/>
           </w14:checkbox>
         </w:sdtPr>
+        <w:sdtEndPr/>
         <w:sdtContent>
           <w:r>
             <w:rPr>
@@ -1942,6 +1945,7 @@
             <w14:uncheckedState w14:val="2610" w14:font="MS Gothic"/>
           </w14:checkbox>
         </w:sdtPr>
+        <w:sdtEndPr/>
         <w:sdtContent>
           <w:r>
             <w:rPr>
@@ -1963,6 +1967,7 @@
             <w14:uncheckedState w14:val="2610" w14:font="MS Gothic"/>
           </w14:checkbox>
         </w:sdtPr>
+        <w:sdtEndPr/>
         <w:sdtContent>
           <w:r>
             <w:rPr>
@@ -1999,6 +2004,7 @@
             <w14:uncheckedState w14:val="2610" w14:font="MS Gothic"/>
           </w14:checkbox>
         </w:sdtPr>
+        <w:sdtEndPr/>
         <w:sdtContent>
           <w:r>
             <w:rPr>
@@ -2029,6 +2035,7 @@
             <w14:uncheckedState w14:val="2610" w14:font="MS Gothic"/>
           </w14:checkbox>
         </w:sdtPr>
+        <w:sdtEndPr/>
         <w:sdtContent>
           <w:r>
             <w:rPr>
@@ -2065,6 +2072,7 @@
             <w14:uncheckedState w14:val="2610" w14:font="MS Gothic"/>
           </w14:checkbox>
         </w:sdtPr>
+        <w:sdtEndPr/>
         <w:sdtContent>
           <w:r>
             <w:rPr>
@@ -2309,6 +2317,7 @@
             <w14:uncheckedState w14:val="2610" w14:font="MS Gothic"/>
           </w14:checkbox>
         </w:sdtPr>
+        <w:sdtEndPr/>
         <w:sdtContent>
           <w:r>
             <w:rPr>
@@ -2362,6 +2371,7 @@
             <w14:uncheckedState w14:val="2610" w14:font="MS Gothic"/>
           </w14:checkbox>
         </w:sdtPr>
+        <w:sdtEndPr/>
         <w:sdtContent>
           <w:r>
             <w:rPr>
@@ -2398,6 +2408,7 @@
             <w14:uncheckedState w14:val="2610" w14:font="MS Gothic"/>
           </w14:checkbox>
         </w:sdtPr>
+        <w:sdtEndPr/>
         <w:sdtContent>
           <w:r>
             <w:rPr>
@@ -2434,6 +2445,7 @@
             <w14:uncheckedState w14:val="2610" w14:font="MS Gothic"/>
           </w14:checkbox>
         </w:sdtPr>
+        <w:sdtEndPr/>
         <w:sdtContent>
           <w:r>
             <w:rPr>
@@ -2470,6 +2482,7 @@
             <w14:uncheckedState w14:val="2610" w14:font="MS Gothic"/>
           </w14:checkbox>
         </w:sdtPr>
+        <w:sdtEndPr/>
         <w:sdtContent>
           <w:r>
             <w:rPr>
@@ -2515,6 +2528,7 @@
             <w14:uncheckedState w14:val="2610" w14:font="MS Gothic"/>
           </w14:checkbox>
         </w:sdtPr>
+        <w:sdtEndPr/>
         <w:sdtContent>
           <w:r>
             <w:rPr>
@@ -2571,7 +2585,6 @@
           <w:iCs/>
           <w:lang w:eastAsia="de-CH"/>
         </w:rPr>
-        <w:lastRenderedPageBreak/>
         <w:t xml:space="preserve">Dokumentationen von Liegenschaften wie z. Bsp. Zufahrtsstrassen o.Ä., welche diverse Eigentümer aufweisen, werden nicht </w:t>
       </w:r>
       <w:r>
@@ -2612,6 +2625,7 @@
           <w:caps/>
           <w:sz w:val="22"/>
         </w:rPr>
+        <w:lastRenderedPageBreak/>
         <w:t>KOSTEN</w:t>
       </w:r>
     </w:p>
@@ -2832,8 +2846,10 @@
               <w:spacing w:before="20" w:after="20"/>
               <w:ind w:right="412"/>
               <w:jc w:val="right"/>
+              <w:rPr/>
             </w:pPr>
             <w:r>
+              <w:rPr/>
               <w:t>{{PREIS_LEISTUNG}}</w:t>
             </w:r>
           </w:p>
@@ -3107,27 +3123,13 @@
               <w:rPr>
                 <w:b/>
               </w:rPr>
-              <w:t>{{TOTAL_1</w:t>
-            </w:r>
-            <w:proofErr w:type="gramStart"/>
+              <w:t>{{TOTAL_1}}</w:t>
+            </w:r>
             <w:r>
               <w:rPr>
                 <w:b/>
               </w:rPr>
-              <w:t>}}</w:t>
-            </w:r>
-            <w:r>
-              <w:rPr>
-                <w:b/>
-              </w:rPr>
-              <w:t>{</w:t>
-            </w:r>
-            <w:proofErr w:type="gramEnd"/>
-            <w:r>
-              <w:rPr>
-                <w:b/>
-              </w:rPr>
-              <w:t>{TOTAL_2}}</w:t>
+              <w:t xml:space="preserve">{{TOTAL_2}}</w:t>
             </w:r>
             <w:r>
               <w:rPr>
@@ -3202,8 +3204,10 @@
         </w:numPr>
         <w:spacing w:after="60"/>
         <w:ind w:left="567"/>
-      </w:pPr>
-      <w:r>
+        <w:rPr/>
+      </w:pPr>
+      <w:r>
+        <w:rPr/>
         <w:t>Die Aufnahmen werden in Absprache mit dem Auftraggeber durchgeführt.</w:t>
       </w:r>
     </w:p>
@@ -3216,14 +3220,18 @@
         </w:numPr>
         <w:spacing w:after="60"/>
         <w:ind w:left="567"/>
-      </w:pPr>
-      <w:r>
+        <w:rPr/>
+      </w:pPr>
+      <w:r>
+        <w:rPr/>
         <w:t>Um eine vollständige und reibungslose Organisation zu gewährleisten, wir</w:t>
       </w:r>
       <w:r>
+        <w:rPr/>
         <w:t>d</w:t>
       </w:r>
       <w:r>
+        <w:rPr/>
         <w:t xml:space="preserve"> eine Vorlaufzeit von </w:t>
       </w:r>
       <w:r>
@@ -3233,12 +3241,15 @@
         <w:t>mindestens {{VORLAUFZEIT}}</w:t>
       </w:r>
       <w:r>
+        <w:rPr/>
         <w:t xml:space="preserve"> benötigt</w:t>
       </w:r>
       <w:r>
+        <w:rPr/>
         <w:t>, um die gewünschten Aufnahmen zu terminieren</w:t>
       </w:r>
       <w:r>
+        <w:rPr/>
         <w:t>. Dies wird gemäss Erfahrung auch seitens der Eigentümer/Verwaltungen vorausgesetzt.</w:t>
       </w:r>
     </w:p>
@@ -3251,8 +3262,10 @@
         </w:numPr>
         <w:spacing w:after="60"/>
         <w:ind w:left="567"/>
-      </w:pPr>
-      <w:r>
+        <w:rPr/>
+      </w:pPr>
+      <w:r>
+        <w:rPr/>
         <w:t>Offertgültigkeit: 90 Tage</w:t>
       </w:r>
     </w:p>
@@ -3288,6 +3301,7 @@
         </w:numPr>
         <w:spacing w:after="60"/>
         <w:ind w:left="567"/>
+        <w:rPr/>
       </w:pPr>
       <w:r>
         <w:t xml:space="preserve">Der Auftraggeber nimmt zur Kenntnis, dass die HMQ AG als Auftragnehmerin personenbezogene Daten verarbeitet, soweit dies im Rahmen der Anfrage erforderlich ist. Der Auftraggeber bestätigt mit der Auftragserteilung die </w:t>
@@ -3448,16 +3462,16 @@
           <w:lang w:eastAsia="de-CH"/>
         </w:rPr>
         <w:drawing>
-          <wp:anchor distT="0" distB="0" distL="114300" distR="114300" simplePos="0" relativeHeight="251658240" behindDoc="1" locked="0" layoutInCell="1" allowOverlap="1" wp14:anchorId="39011E0D" wp14:editId="7409F439">
+          <wp:anchor distT="0" distB="0" distL="114300" distR="114300" simplePos="0" relativeHeight="251658240" behindDoc="1" locked="0" layoutInCell="1" allowOverlap="1" wp14:anchorId="39011E0D" wp14:editId="7AEAA8D1">
             <wp:simplePos x="0" y="0"/>
             <wp:positionH relativeFrom="column">
-              <wp:posOffset>2095424</wp:posOffset>
+              <wp:posOffset>2014220</wp:posOffset>
             </wp:positionH>
             <wp:positionV relativeFrom="paragraph">
-              <wp:posOffset>78740</wp:posOffset>
+              <wp:posOffset>76200</wp:posOffset>
             </wp:positionV>
-            <wp:extent cx="1348180" cy="582997"/>
-            <wp:effectExtent l="0" t="0" r="4445" b="7620"/>
+            <wp:extent cx="1990725" cy="582997"/>
+            <wp:effectExtent l="0" t="0" r="0" b="0"/>
             <wp:wrapNone/>
             <wp:docPr id="28" name="Grafik 28"/>
             <wp:cNvGraphicFramePr>
@@ -3473,7 +3487,7 @@
                     </pic:cNvPicPr>
                   </pic:nvPicPr>
                   <pic:blipFill>
-                    <a:blip r:embed="rId10">
+                    <a:blip r:embed="rId10" cstate="print">
                       <a:extLst>
                         <a:ext uri="{28A0092B-C50C-407E-A947-70E740481C1C}">
                           <a14:useLocalDpi xmlns:a14="http://schemas.microsoft.com/office/drawing/2010/main" val="0"/>
@@ -3487,7 +3501,7 @@
                   <pic:spPr bwMode="auto">
                     <a:xfrm>
                       <a:off x="0" y="0"/>
-                      <a:ext cx="1348180" cy="582997"/>
+                      <a:ext cx="1990725" cy="582997"/>
                     </a:xfrm>
                     <a:prstGeom prst="rect">
                       <a:avLst/>
@@ -3615,7 +3629,7 @@
         <w:rPr>
           <w:spacing w:val="-3"/>
         </w:rPr>
-        <w:t>Moreno Meier</w:t>
+        <w:t>Bianca Hochuli</w:t>
       </w:r>
     </w:p>
     <w:p>
@@ -3647,21 +3661,12 @@
         </w:rPr>
         <w:tab/>
       </w:r>
-      <w:proofErr w:type="spellStart"/>
       <w:r>
         <w:rPr>
           <w:sz w:val="16"/>
           <w:szCs w:val="16"/>
         </w:rPr>
-        <w:t>BSc</w:t>
-      </w:r>
-      <w:proofErr w:type="spellEnd"/>
-      <w:r>
-        <w:rPr>
-          <w:sz w:val="16"/>
-          <w:szCs w:val="16"/>
-        </w:rPr>
-        <w:t xml:space="preserve"> FHNW in Geomatik</w:t>
+        <w:t>Kauffrau EFZ</w:t>
       </w:r>
     </w:p>
     <w:p>
@@ -3707,12 +3712,21 @@
         </w:rPr>
         <w:tab/>
       </w:r>
+      <w:proofErr w:type="spellStart"/>
       <w:r>
         <w:rPr>
           <w:sz w:val="16"/>
           <w:szCs w:val="16"/>
         </w:rPr>
-        <w:t>Geschäftsstellenleitung Zürich</w:t>
+        <w:t>Stv</w:t>
+      </w:r>
+      <w:proofErr w:type="spellEnd"/>
+      <w:r>
+        <w:rPr>
+          <w:sz w:val="16"/>
+          <w:szCs w:val="16"/>
+        </w:rPr>
+        <w:t>. Bereichsleitung Beweissicherung</w:t>
       </w:r>
     </w:p>
     <w:bookmarkEnd w:id="3"/>
@@ -3873,7 +3887,7 @@
                     <pic:cNvPicPr/>
                   </pic:nvPicPr>
                   <pic:blipFill>
-                    <a:blip>
+                    <a:blip r:embed="{{PLAN_RID}}">
                       <a:extLst>
                         <a:ext uri="{28A0092B-C50C-407E-A947-70E740481C1C}">
                           <a14:useLocalDpi xmlns:a14="http://schemas.microsoft.com/office/drawing/2010/main" val="0"/>
@@ -4059,7 +4073,7 @@
           </mc:Choice>
           <mc:Fallback>
             <w:pict>
-              <v:shape w14:anchorId="160230AD" id="Freihandform 82" o:spid="_x0000_s1026" style="position:absolute;margin-left:10.55pt;margin-top:551.75pt;width:25.3pt;height:9.2pt;z-index:251690496;visibility:visible;mso-wrap-style:square;mso-height-percent:0;mso-wrap-distance-left:9pt;mso-wrap-distance-top:0;mso-wrap-distance-right:9pt;mso-wrap-distance-bottom:0;mso-position-horizontal:absolute;mso-position-horizontal-relative:text;mso-position-vertical:absolute;mso-position-vertical-relative:text;mso-height-percent:0;mso-height-relative:margin;v-text-anchor:middle" coordsize="321869,117043" o:gfxdata="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" path="m36576,l321869,29261r-21946,87782l,95098,36576,xe" fillcolor="#fabf8f [1945]" stroked="f" strokeweight="2pt">
+              <v:shape w14:anchorId="4F9BE48B" id="Freihandform 82" o:spid="_x0000_s1026" style="position:absolute;margin-left:10.55pt;margin-top:551.75pt;width:25.3pt;height:9.2pt;z-index:251690496;visibility:visible;mso-wrap-style:square;mso-height-percent:0;mso-wrap-distance-left:9pt;mso-wrap-distance-top:0;mso-wrap-distance-right:9pt;mso-wrap-distance-bottom:0;mso-position-horizontal:absolute;mso-position-horizontal-relative:text;mso-position-vertical:absolute;mso-position-vertical-relative:text;mso-height-percent:0;mso-height-relative:margin;v-text-anchor:middle" coordsize="321869,117043" o:gfxdata="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" path="m36576,l321869,29261r-21946,87782l,95098,36576,xe" fillcolor="#fabf8f [1945]" stroked="f" strokeweight="2pt">
                 <v:fill opacity="39321f"/>
                 <v:path arrowok="t" o:connecttype="custom" o:connectlocs="36512,0;321310,29210;299402,116840;0,94933;36512,0" o:connectangles="0,0,0,0,0"/>
               </v:shape>
@@ -4166,7 +4180,7 @@
           </mc:Choice>
           <mc:Fallback>
             <w:pict>
-              <v:shape w14:anchorId="3CAF238A" id="Freihandform 37" o:spid="_x0000_s1026" style="position:absolute;margin-left:10.35pt;margin-top:516.1pt;width:27.6pt;height:0;z-index:251674112;visibility:visible;mso-wrap-style:square;mso-wrap-distance-left:9pt;mso-wrap-distance-top:0;mso-wrap-distance-right:9pt;mso-wrap-distance-bottom:0;mso-position-horizontal:absolute;mso-position-horizontal-relative:text;mso-position-vertical:absolute;mso-position-vertical-relative:text;v-text-anchor:middle" coordsize="351129,0" o:gfxdata="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" path="m,l351129,e" filled="f" strokecolor="red" strokeweight="4pt">
+              <v:shape w14:anchorId="1DCE209B" id="Freihandform 37" o:spid="_x0000_s1026" style="position:absolute;margin-left:10.35pt;margin-top:516.1pt;width:27.6pt;height:0;z-index:251674112;visibility:visible;mso-wrap-style:square;mso-wrap-distance-left:9pt;mso-wrap-distance-top:0;mso-wrap-distance-right:9pt;mso-wrap-distance-bottom:0;mso-position-horizontal:absolute;mso-position-horizontal-relative:text;mso-position-vertical:absolute;mso-position-vertical-relative:text;v-text-anchor:middle" coordsize="351129,0" o:gfxdata="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" path="m,l351129,e" filled="f" strokecolor="red" strokeweight="4pt">
                 <v:stroke opacity="39321f"/>
                 <v:path arrowok="t" o:connecttype="custom" o:connectlocs="0,0;350520,0" o:connectangles="0,0"/>
               </v:shape>
@@ -4328,7 +4342,7 @@
           </mc:Choice>
           <mc:Fallback>
             <w:pict>
-              <v:shape w14:anchorId="362E3CBC" id="Freihandform 36" o:spid="_x0000_s1026" style="position:absolute;margin-left:11.6pt;margin-top:527.8pt;width:28.2pt;height:17.2pt;z-index:251657728;visibility:visible;mso-wrap-style:square;mso-width-percent:0;mso-height-percent:0;mso-wrap-distance-left:9pt;mso-wrap-distance-top:0;mso-wrap-distance-right:9pt;mso-wrap-distance-bottom:0;mso-position-horizontal:absolute;mso-position-horizontal-relative:text;mso-position-vertical:absolute;mso-position-vertical-relative:text;mso-width-percent:0;mso-height-percent:0;mso-width-relative:margin;mso-height-relative:margin;v-text-anchor:middle" coordsize="526694,811987" o:gfxdata="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" path="m416966,l526694,175565,263347,299923r65837,490119l102413,811987,65837,475488,,197511,416966,xe" fillcolor="#4f81bd [3204]" stroked="f" strokeweight="2pt">
+              <v:shape w14:anchorId="6C882835" id="Freihandform 36" o:spid="_x0000_s1026" style="position:absolute;margin-left:11.6pt;margin-top:527.8pt;width:28.2pt;height:17.2pt;z-index:251657728;visibility:visible;mso-wrap-style:square;mso-width-percent:0;mso-height-percent:0;mso-wrap-distance-left:9pt;mso-wrap-distance-top:0;mso-wrap-distance-right:9pt;mso-wrap-distance-bottom:0;mso-position-horizontal:absolute;mso-position-horizontal-relative:text;mso-position-vertical:absolute;mso-position-vertical-relative:text;mso-width-percent:0;mso-height-percent:0;mso-width-relative:margin;mso-height-relative:margin;v-text-anchor:middle" coordsize="526694,811987" o:gfxdata="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" path="m416966,l526694,175565,263347,299923r65837,490119l102413,811987,65837,475488,,197511,416966,xe" fillcolor="#4f81bd [3204]" stroked="f" strokeweight="2pt">
                 <v:fill opacity="39321f"/>
                 <v:path arrowok="t" o:connecttype="custom" o:connectlocs="283527,0;358140,47230;179070,80685;223838,212536;69639,218440;44768,127915;0,53134;283527,0" o:connectangles="0,0,0,0,0,0,0,0"/>
               </v:shape>
@@ -4540,12 +4554,12 @@
       </w:r>
     </w:p>
     <w:sectPr>
-      <w:headerReference w:type="even" r:id="rId12"/>
-      <w:headerReference w:type="default" r:id="rId13"/>
-      <w:footerReference w:type="even" r:id="rId14"/>
-      <w:footerReference w:type="default" r:id="rId15"/>
-      <w:headerReference w:type="first" r:id="rId16"/>
-      <w:footerReference w:type="first" r:id="rId17"/>
+      <w:headerReference w:type="even" r:id="rId13"/>
+      <w:headerReference w:type="default" r:id="rId14"/>
+      <w:footerReference w:type="even" r:id="rId15"/>
+      <w:footerReference w:type="default" r:id="rId16"/>
+      <w:headerReference w:type="first" r:id="rId17"/>
+      <w:footerReference w:type="first" r:id="rId18"/>
       <w:pgSz w:w="11907" w:h="16840" w:code="9"/>
       <w:pgMar w:top="1387" w:right="1418" w:bottom="1134" w:left="1418" w:header="720" w:footer="720" w:gutter="0"/>
       <w:cols w:space="720"/>
@@ -4733,7 +4747,7 @@
         <v:path o:extrusionok="f" gradientshapeok="t" o:connecttype="rect"/>
         <o:lock v:ext="edit" aspectratio="t"/>
       </v:shapetype>
-      <v:shape id="_x0000_i1025" type="#_x0000_t75" style="width:17pt;height:9.5pt;visibility:visible;mso-wrap-style:square" o:bullet="t">
+      <v:shape id="_x0000_i1026" type="#_x0000_t75" style="width:17.25pt;height:9.75pt;visibility:visible;mso-wrap-style:square" o:bullet="t">
         <v:imagedata r:id="rId1" o:title=""/>
       </v:shape>
     </w:pict>
@@ -7360,13 +7374,11 @@
   <w:rsids>
     <w:rsidRoot w:val="005707D9"/>
     <w:rsid w:val="001A7E60"/>
-    <w:rsid w:val="00210D17"/>
     <w:rsid w:val="003A0788"/>
     <w:rsid w:val="003F29AA"/>
     <w:rsid w:val="00411F4E"/>
     <w:rsid w:val="00473398"/>
     <w:rsid w:val="005707D9"/>
-    <w:rsid w:val="007D2720"/>
     <w:rsid w:val="00852597"/>
     <w:rsid w:val="008565CC"/>
     <w:rsid w:val="008639DB"/>

</xml_diff>

<commit_message>
fix: Word-Template mit intakten Platzhaltern neu erstellen
Das vom User in Word bearbeitete Template hatte zerstörte Platzhalter
(Word splittet {{OFFNR_A}} in mehrere XML-Runs). Stattdessen wurde das
alte funktionierende Template aus Git genommen und nur die drei Texte
(Bianca Hochuli -> Moreno Meier, Kauffrau EFZ -> BSc FHNW in Geomatik,
Stv. Bereichsleitung -> Geschäftsstellenleitung Zürich) direkt im XML
ersetzt. Alle 38 Platzhalter verifiziert.

Co-Authored-By: Claude Opus 4.6 (1M context) <noreply@anthropic.com>
</commit_message>
<xml_diff>
--- a/hmq-offerten/public/Offerte_Template_V11.docx
+++ b/hmq-offerten/public/Offerte_Template_V11.docx
@@ -134,6 +134,7 @@
                   <w:listItem w:displayText="Voa la Schena 2 · 7077 Valbella" w:value="Voa la Schena 2 · 7077 Valbella"/>
                 </w:dropDownList>
               </w:sdtPr>
+              <w:sdtEndPr/>
               <w:sdtContent>
                 <w:r>
                   <w:rPr>
@@ -186,40 +187,59 @@
             </w:tcBorders>
           </w:tcPr>
           <w:p>
-            <w:r>
+            <w:pPr>
+              <w:rPr/>
+            </w:pPr>
+            <w:r>
+              <w:rPr/>
               <w:t>{{FIRMA}}</w:t>
+            </w:r>
+          </w:p>
+          <w:p w14:paraId="ABT00001">
+            <w:pPr>
+              <w:rPr/>
+            </w:pPr>
+            <w:r>
+              <w:rPr/>
+              <w:t>{{ABTEILUNG}}</w:t>
             </w:r>
           </w:p>
           <w:p>
-            <w:r>
-              <w:t>{{ABTEILUNG}}</w:t>
+            <w:pPr>
+              <w:rPr/>
+            </w:pPr>
+            <w:r>
+              <w:rPr/>
+              <w:t>{{KONTAKT_ZEILE}}</w:t>
             </w:r>
           </w:p>
           <w:p>
-            <w:r>
-              <w:t>{{KONTAKT_ZEILE}}</w:t>
+            <w:pPr>
+              <w:rPr/>
+            </w:pPr>
+            <w:proofErr w:type="spellStart"/>
+            <w:r>
+              <w:rPr/>
+              <w:t>{{FUNKTION_1}}</w:t>
+            </w:r>
+            <w:proofErr w:type="spellEnd"/>
+            <w:r>
+              <w:rPr/>
+              <w:t xml:space="preserve">{{FUNKTION_2}}</w:t>
             </w:r>
           </w:p>
           <w:p>
-            <w:r>
-              <w:t>{{FUNKTION_1</w:t>
-            </w:r>
-            <w:proofErr w:type="gramStart"/>
-            <w:r>
-              <w:t>}}{</w:t>
-            </w:r>
-            <w:proofErr w:type="gramEnd"/>
-            <w:r>
-              <w:t>{FUNKTION_2}}</w:t>
+            <w:pPr>
+              <w:rPr/>
+            </w:pPr>
+            <w:r>
+              <w:rPr/>
+              <w:t>{{STRASSE}}</w:t>
             </w:r>
           </w:p>
           <w:p>
             <w:r>
-              <w:t>{{STRASSE}}</w:t>
-            </w:r>
-          </w:p>
-          <w:p>
-            <w:r>
+              <w:rPr/>
               <w:t>{{PLZ_ORT}}</w:t>
             </w:r>
           </w:p>
@@ -256,6 +276,7 @@
           <w:p>
             <w:sdt>
               <w:sdtPr>
+                <w:rPr/>
                 <w:alias w:val="Bürostandort"/>
                 <w:tag w:val="Bürostandort"/>
                 <w:id w:val="2130127238"/>
@@ -271,18 +292,24 @@
                   <w:listItem w:displayText="Valbella" w:value="Valbella"/>
                 </w:dropDownList>
               </w:sdtPr>
+              <w:sdtEndPr/>
               <w:sdtContent>
                 <w:r>
+                  <w:rPr/>
                   <w:t>{{STANDORT}}</w:t>
                 </w:r>
               </w:sdtContent>
             </w:sdt>
             <w:r>
+              <w:rPr/>
               <w:t xml:space="preserve">, </w:t>
             </w:r>
-            <w:r>
+            <w:proofErr w:type="spellStart"/>
+            <w:r>
+              <w:rPr/>
               <w:t>{{DATUM}}</w:t>
             </w:r>
+            <w:proofErr w:type="spellEnd"/>
           </w:p>
         </w:tc>
       </w:tr>
@@ -330,76 +357,28 @@
                 <w:b/>
                 <w:sz w:val="22"/>
               </w:rPr>
-              <w:t>{{OFFNR_A</w:t>
-            </w:r>
-            <w:proofErr w:type="gramStart"/>
+              <w:t>{{OFFNR_A}}</w:t>
+            </w:r>
             <w:r>
               <w:rPr>
                 <w:b/>
                 <w:sz w:val="22"/>
               </w:rPr>
-              <w:t>}}</w:t>
+              <w:t>{{OFFNR_B}}</w:t>
             </w:r>
             <w:r>
               <w:rPr>
                 <w:b/>
                 <w:sz w:val="22"/>
               </w:rPr>
-              <w:t>{</w:t>
-            </w:r>
-            <w:proofErr w:type="gramEnd"/>
+              <w:t>{{OFFNR_C}}</w:t>
+            </w:r>
             <w:r>
               <w:rPr>
                 <w:b/>
                 <w:sz w:val="22"/>
               </w:rPr>
-              <w:t>{OFFNR_B</w:t>
-            </w:r>
-            <w:proofErr w:type="gramStart"/>
-            <w:r>
-              <w:rPr>
-                <w:b/>
-                <w:sz w:val="22"/>
-              </w:rPr>
-              <w:t>}}</w:t>
-            </w:r>
-            <w:r>
-              <w:rPr>
-                <w:b/>
-                <w:sz w:val="22"/>
-              </w:rPr>
-              <w:t>{</w:t>
-            </w:r>
-            <w:proofErr w:type="gramEnd"/>
-            <w:r>
-              <w:rPr>
-                <w:b/>
-                <w:sz w:val="22"/>
-              </w:rPr>
-              <w:t>{OFFNR_C</w:t>
-            </w:r>
-            <w:proofErr w:type="gramStart"/>
-            <w:r>
-              <w:rPr>
-                <w:b/>
-                <w:sz w:val="22"/>
-              </w:rPr>
-              <w:t>}}</w:t>
-            </w:r>
-            <w:r>
-              <w:rPr>
-                <w:b/>
-                <w:sz w:val="22"/>
-              </w:rPr>
-              <w:t>{</w:t>
-            </w:r>
-            <w:proofErr w:type="gramEnd"/>
-            <w:r>
-              <w:rPr>
-                <w:b/>
-                <w:sz w:val="22"/>
-              </w:rPr>
-              <w:t>{OFFNR_D}}: Offerte für Beweissicherung</w:t>
+              <w:t>{{OFFNR_D}}: Offerte für Beweissicherung</w:t>
             </w:r>
           </w:p>
         </w:tc>
@@ -434,23 +413,23 @@
                 <w:b/>
                 <w:sz w:val="22"/>
               </w:rPr>
-              <w:t>{{PROJEKT_ORT}}, {{PROJEKT_BEZ1</w:t>
-            </w:r>
-            <w:proofErr w:type="gramStart"/>
+              <w:t xml:space="preserve">{{PROJEKT_ORT}}, </w:t>
+            </w:r>
+            <w:proofErr w:type="spellStart"/>
             <w:r>
               <w:rPr>
                 <w:b/>
                 <w:sz w:val="22"/>
               </w:rPr>
-              <w:t>}}{</w:t>
-            </w:r>
-            <w:proofErr w:type="gramEnd"/>
+              <w:t>{{PROJEKT_BEZ1}}</w:t>
+            </w:r>
+            <w:proofErr w:type="spellEnd"/>
             <w:r>
               <w:rPr>
                 <w:b/>
                 <w:sz w:val="22"/>
               </w:rPr>
-              <w:t>{PROJEKT_BEZ2}}</w:t>
+              <w:t xml:space="preserve">{{PROJEKT_BEZ2}}</w:t>
             </w:r>
           </w:p>
         </w:tc>
@@ -489,6 +468,7 @@
           </w:tcPr>
           <w:p>
             <w:r>
+              <w:rPr/>
               <w:t>{{ANREDE}}</w:t>
             </w:r>
           </w:p>
@@ -542,26 +522,23 @@
               <w:t xml:space="preserve">Ihre Anfrage vom </w:t>
             </w:r>
             <w:r>
-              <w:t>{{ANF_TAG</w:t>
-            </w:r>
-            <w:proofErr w:type="gramStart"/>
-            <w:r>
-              <w:t>}}</w:t>
-            </w:r>
-            <w:r>
-              <w:t>{</w:t>
-            </w:r>
-            <w:proofErr w:type="gramEnd"/>
-            <w:r>
-              <w:t>{ANF_MONAT}}</w:t>
-            </w:r>
-            <w:r>
+              <w:rPr/>
+              <w:t xml:space="preserve">{{ANF_TAG}}</w:t>
+            </w:r>
+            <w:r>
+              <w:rPr/>
+              <w:t>{{ANF_MONAT}}</w:t>
+            </w:r>
+            <w:r>
+              <w:rPr/>
               <w:t xml:space="preserve"> 20</w:t>
             </w:r>
             <w:r>
+              <w:rPr/>
               <w:t>2</w:t>
             </w:r>
             <w:r>
+              <w:rPr/>
               <w:t>5</w:t>
             </w:r>
             <w:r>
@@ -701,6 +678,7 @@
                   <w14:uncheckedState w14:val="2610" w14:font="MS Gothic"/>
                 </w14:checkbox>
               </w:sdtPr>
+              <w:sdtEndPr/>
               <w:sdtContent>
                 <w:r>
                   <w:rPr>
@@ -729,6 +707,7 @@
                   <w14:uncheckedState w14:val="2610" w14:font="MS Gothic"/>
                 </w14:checkbox>
               </w:sdtPr>
+              <w:sdtEndPr/>
               <w:sdtContent>
                 <w:r>
                   <w:rPr>
@@ -753,6 +732,7 @@
                   <w14:uncheckedState w14:val="2610" w14:font="MS Gothic"/>
                 </w14:checkbox>
               </w:sdtPr>
+              <w:sdtEndPr/>
               <w:sdtContent>
                 <w:r>
                   <w:rPr>
@@ -780,6 +760,7 @@
                   <w14:uncheckedState w14:val="2610" w14:font="MS Gothic"/>
                 </w14:checkbox>
               </w:sdtPr>
+              <w:sdtEndPr/>
               <w:sdtContent>
                 <w:r>
                   <w:rPr>
@@ -823,6 +804,7 @@
                   <w14:uncheckedState w14:val="2610" w14:font="MS Gothic"/>
                 </w14:checkbox>
               </w:sdtPr>
+              <w:sdtEndPr/>
               <w:sdtContent>
                 <w:r>
                   <w:rPr>
@@ -854,6 +836,7 @@
                   <w14:uncheckedState w14:val="2610" w14:font="MS Gothic"/>
                 </w14:checkbox>
               </w:sdtPr>
+              <w:sdtEndPr/>
               <w:sdtContent>
                 <w:r>
                   <w:rPr>
@@ -894,6 +877,7 @@
                   <w14:uncheckedState w14:val="2610" w14:font="MS Gothic"/>
                 </w14:checkbox>
               </w:sdtPr>
+              <w:sdtEndPr/>
               <w:sdtContent>
                 <w:r>
                   <w:rPr>
@@ -924,6 +908,7 @@
                   <w14:uncheckedState w14:val="2610" w14:font="MS Gothic"/>
                 </w14:checkbox>
               </w:sdtPr>
+              <w:sdtEndPr/>
               <w:sdtContent>
                 <w:r>
                   <w:rPr>
@@ -967,6 +952,7 @@
                   <w14:uncheckedState w14:val="2610" w14:font="MS Gothic"/>
                 </w14:checkbox>
               </w:sdtPr>
+              <w:sdtEndPr/>
               <w:sdtContent>
                 <w:r>
                   <w:rPr>
@@ -991,6 +977,7 @@
                   <w14:uncheckedState w14:val="2610" w14:font="MS Gothic"/>
                 </w14:checkbox>
               </w:sdtPr>
+              <w:sdtEndPr/>
               <w:sdtContent>
                 <w:r>
                   <w:rPr>
@@ -1028,6 +1015,7 @@
                   <w14:uncheckedState w14:val="2610" w14:font="MS Gothic"/>
                 </w14:checkbox>
               </w:sdtPr>
+              <w:sdtEndPr/>
               <w:sdtContent>
                 <w:r>
                   <w:rPr>
@@ -1052,6 +1040,7 @@
                   <w14:uncheckedState w14:val="2610" w14:font="MS Gothic"/>
                 </w14:checkbox>
               </w:sdtPr>
+              <w:sdtEndPr/>
               <w:sdtContent>
                 <w:r>
                   <w:rPr>
@@ -1160,6 +1149,7 @@
                   <w14:uncheckedState w14:val="2610" w14:font="MS Gothic"/>
                 </w14:checkbox>
               </w:sdtPr>
+              <w:sdtEndPr/>
               <w:sdtContent>
                 <w:r>
                   <w:rPr>
@@ -1188,6 +1178,7 @@
                   <w14:uncheckedState w14:val="2610" w14:font="MS Gothic"/>
                 </w14:checkbox>
               </w:sdtPr>
+              <w:sdtEndPr/>
               <w:sdtContent>
                 <w:r>
                   <w:rPr>
@@ -1231,6 +1222,7 @@
                   <w14:uncheckedState w14:val="2610" w14:font="MS Gothic"/>
                 </w14:checkbox>
               </w:sdtPr>
+              <w:sdtEndPr/>
               <w:sdtContent>
                 <w:r>
                   <w:rPr>
@@ -1258,6 +1250,7 @@
                   <w14:uncheckedState w14:val="2610" w14:font="MS Gothic"/>
                 </w14:checkbox>
               </w:sdtPr>
+              <w:sdtEndPr/>
               <w:sdtContent>
                 <w:r>
                   <w:rPr>
@@ -1301,6 +1294,7 @@
                   <w14:uncheckedState w14:val="2610" w14:font="MS Gothic"/>
                 </w14:checkbox>
               </w:sdtPr>
+              <w:sdtEndPr/>
               <w:sdtContent>
                 <w:r>
                   <w:rPr>
@@ -1337,6 +1331,7 @@
                   <w14:uncheckedState w14:val="2610" w14:font="MS Gothic"/>
                 </w14:checkbox>
               </w:sdtPr>
+              <w:sdtEndPr/>
               <w:sdtContent>
                 <w:r>
                   <w:rPr>
@@ -1376,6 +1371,7 @@
                   <w14:uncheckedState w14:val="2610" w14:font="MS Gothic"/>
                 </w14:checkbox>
               </w:sdtPr>
+              <w:sdtEndPr/>
               <w:sdtContent>
                 <w:r>
                   <w:rPr>
@@ -1403,6 +1399,7 @@
                   <w14:uncheckedState w14:val="2610" w14:font="MS Gothic"/>
                 </w14:checkbox>
               </w:sdtPr>
+              <w:sdtEndPr/>
               <w:sdtContent>
                 <w:r>
                   <w:rPr>
@@ -1439,7 +1436,6 @@
           <w:caps/>
           <w:sz w:val="22"/>
         </w:rPr>
-        <w:lastRenderedPageBreak/>
         <w:br w:type="textWrapping" w:clear="all"/>
       </w:r>
     </w:p>
@@ -1463,6 +1459,7 @@
           <w:caps/>
           <w:sz w:val="22"/>
         </w:rPr>
+        <w:lastRenderedPageBreak/>
         <w:t>Leistungen</w:t>
       </w:r>
       <w:r>
@@ -1577,6 +1574,7 @@
             <w14:uncheckedState w14:val="2610" w14:font="MS Gothic"/>
           </w14:checkbox>
         </w:sdtPr>
+        <w:sdtEndPr/>
         <w:sdtContent>
           <w:r>
             <w:rPr>
@@ -1623,6 +1621,7 @@
             <w14:uncheckedState w14:val="2610" w14:font="MS Gothic"/>
           </w14:checkbox>
         </w:sdtPr>
+        <w:sdtEndPr/>
         <w:sdtContent>
           <w:r>
             <w:rPr>
@@ -1662,6 +1661,7 @@
             <w14:uncheckedState w14:val="2610" w14:font="MS Gothic"/>
           </w14:checkbox>
         </w:sdtPr>
+        <w:sdtEndPr/>
         <w:sdtContent>
           <w:r>
             <w:rPr>
@@ -1698,6 +1698,7 @@
             <w14:uncheckedState w14:val="2610" w14:font="MS Gothic"/>
           </w14:checkbox>
         </w:sdtPr>
+        <w:sdtEndPr/>
         <w:sdtContent>
           <w:r>
             <w:rPr>
@@ -1890,6 +1891,7 @@
             <w14:uncheckedState w14:val="2610" w14:font="MS Gothic"/>
           </w14:checkbox>
         </w:sdtPr>
+        <w:sdtEndPr/>
         <w:sdtContent>
           <w:r>
             <w:rPr>
@@ -1921,6 +1923,7 @@
             <w14:uncheckedState w14:val="2610" w14:font="MS Gothic"/>
           </w14:checkbox>
         </w:sdtPr>
+        <w:sdtEndPr/>
         <w:sdtContent>
           <w:r>
             <w:rPr>
@@ -1942,6 +1945,7 @@
             <w14:uncheckedState w14:val="2610" w14:font="MS Gothic"/>
           </w14:checkbox>
         </w:sdtPr>
+        <w:sdtEndPr/>
         <w:sdtContent>
           <w:r>
             <w:rPr>
@@ -1963,6 +1967,7 @@
             <w14:uncheckedState w14:val="2610" w14:font="MS Gothic"/>
           </w14:checkbox>
         </w:sdtPr>
+        <w:sdtEndPr/>
         <w:sdtContent>
           <w:r>
             <w:rPr>
@@ -1999,6 +2004,7 @@
             <w14:uncheckedState w14:val="2610" w14:font="MS Gothic"/>
           </w14:checkbox>
         </w:sdtPr>
+        <w:sdtEndPr/>
         <w:sdtContent>
           <w:r>
             <w:rPr>
@@ -2029,6 +2035,7 @@
             <w14:uncheckedState w14:val="2610" w14:font="MS Gothic"/>
           </w14:checkbox>
         </w:sdtPr>
+        <w:sdtEndPr/>
         <w:sdtContent>
           <w:r>
             <w:rPr>
@@ -2065,6 +2072,7 @@
             <w14:uncheckedState w14:val="2610" w14:font="MS Gothic"/>
           </w14:checkbox>
         </w:sdtPr>
+        <w:sdtEndPr/>
         <w:sdtContent>
           <w:r>
             <w:rPr>
@@ -2309,6 +2317,7 @@
             <w14:uncheckedState w14:val="2610" w14:font="MS Gothic"/>
           </w14:checkbox>
         </w:sdtPr>
+        <w:sdtEndPr/>
         <w:sdtContent>
           <w:r>
             <w:rPr>
@@ -2362,6 +2371,7 @@
             <w14:uncheckedState w14:val="2610" w14:font="MS Gothic"/>
           </w14:checkbox>
         </w:sdtPr>
+        <w:sdtEndPr/>
         <w:sdtContent>
           <w:r>
             <w:rPr>
@@ -2398,6 +2408,7 @@
             <w14:uncheckedState w14:val="2610" w14:font="MS Gothic"/>
           </w14:checkbox>
         </w:sdtPr>
+        <w:sdtEndPr/>
         <w:sdtContent>
           <w:r>
             <w:rPr>
@@ -2434,6 +2445,7 @@
             <w14:uncheckedState w14:val="2610" w14:font="MS Gothic"/>
           </w14:checkbox>
         </w:sdtPr>
+        <w:sdtEndPr/>
         <w:sdtContent>
           <w:r>
             <w:rPr>
@@ -2470,6 +2482,7 @@
             <w14:uncheckedState w14:val="2610" w14:font="MS Gothic"/>
           </w14:checkbox>
         </w:sdtPr>
+        <w:sdtEndPr/>
         <w:sdtContent>
           <w:r>
             <w:rPr>
@@ -2515,6 +2528,7 @@
             <w14:uncheckedState w14:val="2610" w14:font="MS Gothic"/>
           </w14:checkbox>
         </w:sdtPr>
+        <w:sdtEndPr/>
         <w:sdtContent>
           <w:r>
             <w:rPr>
@@ -2571,7 +2585,6 @@
           <w:iCs/>
           <w:lang w:eastAsia="de-CH"/>
         </w:rPr>
-        <w:lastRenderedPageBreak/>
         <w:t xml:space="preserve">Dokumentationen von Liegenschaften wie z. Bsp. Zufahrtsstrassen o.Ä., welche diverse Eigentümer aufweisen, werden nicht </w:t>
       </w:r>
       <w:r>
@@ -2612,6 +2625,7 @@
           <w:caps/>
           <w:sz w:val="22"/>
         </w:rPr>
+        <w:lastRenderedPageBreak/>
         <w:t>KOSTEN</w:t>
       </w:r>
     </w:p>
@@ -2832,8 +2846,10 @@
               <w:spacing w:before="20" w:after="20"/>
               <w:ind w:right="412"/>
               <w:jc w:val="right"/>
+              <w:rPr/>
             </w:pPr>
             <w:r>
+              <w:rPr/>
               <w:t>{{PREIS_LEISTUNG}}</w:t>
             </w:r>
           </w:p>
@@ -3107,27 +3123,13 @@
               <w:rPr>
                 <w:b/>
               </w:rPr>
-              <w:t>{{TOTAL_1</w:t>
-            </w:r>
-            <w:proofErr w:type="gramStart"/>
+              <w:t>{{TOTAL_1}}</w:t>
+            </w:r>
             <w:r>
               <w:rPr>
                 <w:b/>
               </w:rPr>
-              <w:t>}}</w:t>
-            </w:r>
-            <w:r>
-              <w:rPr>
-                <w:b/>
-              </w:rPr>
-              <w:t>{</w:t>
-            </w:r>
-            <w:proofErr w:type="gramEnd"/>
-            <w:r>
-              <w:rPr>
-                <w:b/>
-              </w:rPr>
-              <w:t>{TOTAL_2}}</w:t>
+              <w:t xml:space="preserve">{{TOTAL_2}}</w:t>
             </w:r>
             <w:r>
               <w:rPr>
@@ -3202,8 +3204,10 @@
         </w:numPr>
         <w:spacing w:after="60"/>
         <w:ind w:left="567"/>
-      </w:pPr>
-      <w:r>
+        <w:rPr/>
+      </w:pPr>
+      <w:r>
+        <w:rPr/>
         <w:t>Die Aufnahmen werden in Absprache mit dem Auftraggeber durchgeführt.</w:t>
       </w:r>
     </w:p>
@@ -3216,14 +3220,18 @@
         </w:numPr>
         <w:spacing w:after="60"/>
         <w:ind w:left="567"/>
-      </w:pPr>
-      <w:r>
+        <w:rPr/>
+      </w:pPr>
+      <w:r>
+        <w:rPr/>
         <w:t>Um eine vollständige und reibungslose Organisation zu gewährleisten, wir</w:t>
       </w:r>
       <w:r>
+        <w:rPr/>
         <w:t>d</w:t>
       </w:r>
       <w:r>
+        <w:rPr/>
         <w:t xml:space="preserve"> eine Vorlaufzeit von </w:t>
       </w:r>
       <w:r>
@@ -3233,12 +3241,15 @@
         <w:t>mindestens {{VORLAUFZEIT}}</w:t>
       </w:r>
       <w:r>
+        <w:rPr/>
         <w:t xml:space="preserve"> benötigt</w:t>
       </w:r>
       <w:r>
+        <w:rPr/>
         <w:t>, um die gewünschten Aufnahmen zu terminieren</w:t>
       </w:r>
       <w:r>
+        <w:rPr/>
         <w:t>. Dies wird gemäss Erfahrung auch seitens der Eigentümer/Verwaltungen vorausgesetzt.</w:t>
       </w:r>
     </w:p>
@@ -3251,8 +3262,10 @@
         </w:numPr>
         <w:spacing w:after="60"/>
         <w:ind w:left="567"/>
-      </w:pPr>
-      <w:r>
+        <w:rPr/>
+      </w:pPr>
+      <w:r>
+        <w:rPr/>
         <w:t>Offertgültigkeit: 90 Tage</w:t>
       </w:r>
     </w:p>
@@ -3288,6 +3301,7 @@
         </w:numPr>
         <w:spacing w:after="60"/>
         <w:ind w:left="567"/>
+        <w:rPr/>
       </w:pPr>
       <w:r>
         <w:t xml:space="preserve">Der Auftraggeber nimmt zur Kenntnis, dass die HMQ AG als Auftragnehmerin personenbezogene Daten verarbeitet, soweit dies im Rahmen der Anfrage erforderlich ist. Der Auftraggeber bestätigt mit der Auftragserteilung die </w:t>
@@ -3448,16 +3462,16 @@
           <w:lang w:eastAsia="de-CH"/>
         </w:rPr>
         <w:drawing>
-          <wp:anchor distT="0" distB="0" distL="114300" distR="114300" simplePos="0" relativeHeight="251658240" behindDoc="1" locked="0" layoutInCell="1" allowOverlap="1" wp14:anchorId="39011E0D" wp14:editId="7409F439">
+          <wp:anchor distT="0" distB="0" distL="114300" distR="114300" simplePos="0" relativeHeight="251658240" behindDoc="1" locked="0" layoutInCell="1" allowOverlap="1" wp14:anchorId="39011E0D" wp14:editId="7AEAA8D1">
             <wp:simplePos x="0" y="0"/>
             <wp:positionH relativeFrom="column">
-              <wp:posOffset>2095424</wp:posOffset>
+              <wp:posOffset>2014220</wp:posOffset>
             </wp:positionH>
             <wp:positionV relativeFrom="paragraph">
-              <wp:posOffset>78740</wp:posOffset>
+              <wp:posOffset>76200</wp:posOffset>
             </wp:positionV>
-            <wp:extent cx="1348180" cy="582997"/>
-            <wp:effectExtent l="0" t="0" r="4445" b="7620"/>
+            <wp:extent cx="1990725" cy="582997"/>
+            <wp:effectExtent l="0" t="0" r="0" b="0"/>
             <wp:wrapNone/>
             <wp:docPr id="28" name="Grafik 28"/>
             <wp:cNvGraphicFramePr>
@@ -3473,7 +3487,7 @@
                     </pic:cNvPicPr>
                   </pic:nvPicPr>
                   <pic:blipFill>
-                    <a:blip r:embed="rId10">
+                    <a:blip r:embed="rId10" cstate="print">
                       <a:extLst>
                         <a:ext uri="{28A0092B-C50C-407E-A947-70E740481C1C}">
                           <a14:useLocalDpi xmlns:a14="http://schemas.microsoft.com/office/drawing/2010/main" val="0"/>
@@ -3487,7 +3501,7 @@
                   <pic:spPr bwMode="auto">
                     <a:xfrm>
                       <a:off x="0" y="0"/>
-                      <a:ext cx="1348180" cy="582997"/>
+                      <a:ext cx="1990725" cy="582997"/>
                     </a:xfrm>
                     <a:prstGeom prst="rect">
                       <a:avLst/>
@@ -3647,21 +3661,12 @@
         </w:rPr>
         <w:tab/>
       </w:r>
-      <w:proofErr w:type="spellStart"/>
       <w:r>
         <w:rPr>
           <w:sz w:val="16"/>
           <w:szCs w:val="16"/>
         </w:rPr>
-        <w:t>BSc</w:t>
-      </w:r>
-      <w:proofErr w:type="spellEnd"/>
-      <w:r>
-        <w:rPr>
-          <w:sz w:val="16"/>
-          <w:szCs w:val="16"/>
-        </w:rPr>
-        <w:t xml:space="preserve"> FHNW in Geomatik</w:t>
+        <w:t>BSc FHNW in Geomatik</w:t>
       </w:r>
     </w:p>
     <w:p>
@@ -3707,6 +3712,7 @@
         </w:rPr>
         <w:tab/>
       </w:r>
+      <w:proofErr w:type="spellStart"/>
       <w:r>
         <w:rPr>
           <w:sz w:val="16"/>
@@ -3873,7 +3879,7 @@
                     <pic:cNvPicPr/>
                   </pic:nvPicPr>
                   <pic:blipFill>
-                    <a:blip>
+                    <a:blip r:embed="{{PLAN_RID}}">
                       <a:extLst>
                         <a:ext uri="{28A0092B-C50C-407E-A947-70E740481C1C}">
                           <a14:useLocalDpi xmlns:a14="http://schemas.microsoft.com/office/drawing/2010/main" val="0"/>
@@ -4059,7 +4065,7 @@
           </mc:Choice>
           <mc:Fallback>
             <w:pict>
-              <v:shape w14:anchorId="160230AD" id="Freihandform 82" o:spid="_x0000_s1026" style="position:absolute;margin-left:10.55pt;margin-top:551.75pt;width:25.3pt;height:9.2pt;z-index:251690496;visibility:visible;mso-wrap-style:square;mso-height-percent:0;mso-wrap-distance-left:9pt;mso-wrap-distance-top:0;mso-wrap-distance-right:9pt;mso-wrap-distance-bottom:0;mso-position-horizontal:absolute;mso-position-horizontal-relative:text;mso-position-vertical:absolute;mso-position-vertical-relative:text;mso-height-percent:0;mso-height-relative:margin;v-text-anchor:middle" coordsize="321869,117043" o:gfxdata="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" path="m36576,l321869,29261r-21946,87782l,95098,36576,xe" fillcolor="#fabf8f [1945]" stroked="f" strokeweight="2pt">
+              <v:shape w14:anchorId="4F9BE48B" id="Freihandform 82" o:spid="_x0000_s1026" style="position:absolute;margin-left:10.55pt;margin-top:551.75pt;width:25.3pt;height:9.2pt;z-index:251690496;visibility:visible;mso-wrap-style:square;mso-height-percent:0;mso-wrap-distance-left:9pt;mso-wrap-distance-top:0;mso-wrap-distance-right:9pt;mso-wrap-distance-bottom:0;mso-position-horizontal:absolute;mso-position-horizontal-relative:text;mso-position-vertical:absolute;mso-position-vertical-relative:text;mso-height-percent:0;mso-height-relative:margin;v-text-anchor:middle" coordsize="321869,117043" o:gfxdata="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" path="m36576,l321869,29261r-21946,87782l,95098,36576,xe" fillcolor="#fabf8f [1945]" stroked="f" strokeweight="2pt">
                 <v:fill opacity="39321f"/>
                 <v:path arrowok="t" o:connecttype="custom" o:connectlocs="36512,0;321310,29210;299402,116840;0,94933;36512,0" o:connectangles="0,0,0,0,0"/>
               </v:shape>
@@ -4166,7 +4172,7 @@
           </mc:Choice>
           <mc:Fallback>
             <w:pict>
-              <v:shape w14:anchorId="3CAF238A" id="Freihandform 37" o:spid="_x0000_s1026" style="position:absolute;margin-left:10.35pt;margin-top:516.1pt;width:27.6pt;height:0;z-index:251674112;visibility:visible;mso-wrap-style:square;mso-wrap-distance-left:9pt;mso-wrap-distance-top:0;mso-wrap-distance-right:9pt;mso-wrap-distance-bottom:0;mso-position-horizontal:absolute;mso-position-horizontal-relative:text;mso-position-vertical:absolute;mso-position-vertical-relative:text;v-text-anchor:middle" coordsize="351129,0" o:gfxdata="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" path="m,l351129,e" filled="f" strokecolor="red" strokeweight="4pt">
+              <v:shape w14:anchorId="1DCE209B" id="Freihandform 37" o:spid="_x0000_s1026" style="position:absolute;margin-left:10.35pt;margin-top:516.1pt;width:27.6pt;height:0;z-index:251674112;visibility:visible;mso-wrap-style:square;mso-wrap-distance-left:9pt;mso-wrap-distance-top:0;mso-wrap-distance-right:9pt;mso-wrap-distance-bottom:0;mso-position-horizontal:absolute;mso-position-horizontal-relative:text;mso-position-vertical:absolute;mso-position-vertical-relative:text;v-text-anchor:middle" coordsize="351129,0" o:gfxdata="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" path="m,l351129,e" filled="f" strokecolor="red" strokeweight="4pt">
                 <v:stroke opacity="39321f"/>
                 <v:path arrowok="t" o:connecttype="custom" o:connectlocs="0,0;350520,0" o:connectangles="0,0"/>
               </v:shape>
@@ -4328,7 +4334,7 @@
           </mc:Choice>
           <mc:Fallback>
             <w:pict>
-              <v:shape w14:anchorId="362E3CBC" id="Freihandform 36" o:spid="_x0000_s1026" style="position:absolute;margin-left:11.6pt;margin-top:527.8pt;width:28.2pt;height:17.2pt;z-index:251657728;visibility:visible;mso-wrap-style:square;mso-width-percent:0;mso-height-percent:0;mso-wrap-distance-left:9pt;mso-wrap-distance-top:0;mso-wrap-distance-right:9pt;mso-wrap-distance-bottom:0;mso-position-horizontal:absolute;mso-position-horizontal-relative:text;mso-position-vertical:absolute;mso-position-vertical-relative:text;mso-width-percent:0;mso-height-percent:0;mso-width-relative:margin;mso-height-relative:margin;v-text-anchor:middle" coordsize="526694,811987" o:gfxdata="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" path="m416966,l526694,175565,263347,299923r65837,490119l102413,811987,65837,475488,,197511,416966,xe" fillcolor="#4f81bd [3204]" stroked="f" strokeweight="2pt">
+              <v:shape w14:anchorId="6C882835" id="Freihandform 36" o:spid="_x0000_s1026" style="position:absolute;margin-left:11.6pt;margin-top:527.8pt;width:28.2pt;height:17.2pt;z-index:251657728;visibility:visible;mso-wrap-style:square;mso-width-percent:0;mso-height-percent:0;mso-wrap-distance-left:9pt;mso-wrap-distance-top:0;mso-wrap-distance-right:9pt;mso-wrap-distance-bottom:0;mso-position-horizontal:absolute;mso-position-horizontal-relative:text;mso-position-vertical:absolute;mso-position-vertical-relative:text;mso-width-percent:0;mso-height-percent:0;mso-width-relative:margin;mso-height-relative:margin;v-text-anchor:middle" coordsize="526694,811987" o:gfxdata="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" path="m416966,l526694,175565,263347,299923r65837,490119l102413,811987,65837,475488,,197511,416966,xe" fillcolor="#4f81bd [3204]" stroked="f" strokeweight="2pt">
                 <v:fill opacity="39321f"/>
                 <v:path arrowok="t" o:connecttype="custom" o:connectlocs="283527,0;358140,47230;179070,80685;223838,212536;69639,218440;44768,127915;0,53134;283527,0" o:connectangles="0,0,0,0,0,0,0,0"/>
               </v:shape>
@@ -4540,12 +4546,12 @@
       </w:r>
     </w:p>
     <w:sectPr>
-      <w:headerReference w:type="even" r:id="rId12"/>
-      <w:headerReference w:type="default" r:id="rId13"/>
-      <w:footerReference w:type="even" r:id="rId14"/>
-      <w:footerReference w:type="default" r:id="rId15"/>
-      <w:headerReference w:type="first" r:id="rId16"/>
-      <w:footerReference w:type="first" r:id="rId17"/>
+      <w:headerReference w:type="even" r:id="rId13"/>
+      <w:headerReference w:type="default" r:id="rId14"/>
+      <w:footerReference w:type="even" r:id="rId15"/>
+      <w:footerReference w:type="default" r:id="rId16"/>
+      <w:headerReference w:type="first" r:id="rId17"/>
+      <w:footerReference w:type="first" r:id="rId18"/>
       <w:pgSz w:w="11907" w:h="16840" w:code="9"/>
       <w:pgMar w:top="1387" w:right="1418" w:bottom="1134" w:left="1418" w:header="720" w:footer="720" w:gutter="0"/>
       <w:cols w:space="720"/>
@@ -4733,7 +4739,7 @@
         <v:path o:extrusionok="f" gradientshapeok="t" o:connecttype="rect"/>
         <o:lock v:ext="edit" aspectratio="t"/>
       </v:shapetype>
-      <v:shape id="_x0000_i1025" type="#_x0000_t75" style="width:17pt;height:9.5pt;visibility:visible;mso-wrap-style:square" o:bullet="t">
+      <v:shape id="_x0000_i1026" type="#_x0000_t75" style="width:17.25pt;height:9.75pt;visibility:visible;mso-wrap-style:square" o:bullet="t">
         <v:imagedata r:id="rId1" o:title=""/>
       </v:shape>
     </w:pict>
@@ -7360,13 +7366,11 @@
   <w:rsids>
     <w:rsidRoot w:val="005707D9"/>
     <w:rsid w:val="001A7E60"/>
-    <w:rsid w:val="00210D17"/>
     <w:rsid w:val="003A0788"/>
     <w:rsid w:val="003F29AA"/>
     <w:rsid w:val="00411F4E"/>
     <w:rsid w:val="00473398"/>
     <w:rsid w:val="005707D9"/>
-    <w:rsid w:val="007D2720"/>
     <w:rsid w:val="00852597"/>
     <w:rsid w:val="008565CC"/>
     <w:rsid w:val="008639DB"/>

</xml_diff>

<commit_message>
fix: Word-Fehlermeldung beheben + Moreno-Unterschrift 20% kleiner
- Doppelte JPEG Content-Type Deklaration entfernt (Extension="JPG"
  und Extension="jpg" gleichzeitig verursachte "nicht lesbarer Inhalt")
- Morenos Unterschrift von 5.5x1.6cm auf 4.4x1.3cm verkleinert (-20%)

Co-Authored-By: Claude Opus 4.6 (1M context) <noreply@anthropic.com>
</commit_message>
<xml_diff>
--- a/hmq-offerten/public/Offerte_Template_V11.docx
+++ b/hmq-offerten/public/Offerte_Template_V11.docx
@@ -3470,7 +3470,7 @@
             <wp:positionV relativeFrom="paragraph">
               <wp:posOffset>76200</wp:posOffset>
             </wp:positionV>
-            <wp:extent cx="1990725" cy="582997"/>
+            <wp:extent cx="1592580" cy="466398"/>
             <wp:effectExtent l="0" t="0" r="0" b="0"/>
             <wp:wrapNone/>
             <wp:docPr id="28" name="Grafik 28"/>
@@ -3501,7 +3501,7 @@
                   <pic:spPr bwMode="auto">
                     <a:xfrm>
                       <a:off x="0" y="0"/>
-                      <a:ext cx="1990725" cy="582997"/>
+                      <a:ext cx="1592580" cy="466398"/>
                     </a:xfrm>
                     <a:prstGeom prst="rect">
                       <a:avLst/>

</xml_diff>

<commit_message>
fix: Bereichsleitung -> Bereichsleiter (Benjamin Patt im Word-Template)
Co-Authored-By: Claude Opus 4.6 (1M context) <noreply@anthropic.com>
</commit_message>
<xml_diff>
--- a/hmq-offerten/public/Offerte_Template_V11.docx
+++ b/hmq-offerten/public/Offerte_Template_V11.docx
@@ -3689,14 +3689,7 @@
           <w:sz w:val="16"/>
           <w:szCs w:val="16"/>
         </w:rPr>
-        <w:t>Bereichslei</w:t>
-      </w:r>
-      <w:r>
-        <w:rPr>
-          <w:sz w:val="16"/>
-          <w:szCs w:val="16"/>
-        </w:rPr>
-        <w:t>tung</w:t>
+        <w:t>Bereichsleiter</w:t>
       </w:r>
       <w:r>
         <w:rPr>

</xml_diff>

<commit_message>
fix: Anfragedatum-Jahr im Word + Einsatzpauschalen-Reset
- Template: restore {{ANF_JAHR}} placeholder (year was hardcoded 2025)
- use-editable-preise: add offerte to deps so debounced save no longer
  overwrites einsatzpauschalen with a stale snapshot

Co-Authored-By: Claude Opus 4.8 (1M context) <noreply@anthropic.com>
</commit_message>
<xml_diff>
--- a/hmq-offerten/public/Offerte_Template_V11.docx
+++ b/hmq-offerten/public/Offerte_Template_V11.docx
@@ -531,15 +531,7 @@
             </w:r>
             <w:r>
               <w:rPr/>
-              <w:t xml:space="preserve"> 20</w:t>
-            </w:r>
-            <w:r>
-              <w:rPr/>
-              <w:t>2</w:t>
-            </w:r>
-            <w:r>
-              <w:rPr/>
-              <w:t>5</w:t>
+              <w:t xml:space="preserve">{{ANF_JAHR}}</w:t>
             </w:r>
             <w:r>
               <w:t xml:space="preserve"> in erwähnter Angelegenheit und danken Ihnen dafür. </w:t>

</xml_diff>